<commit_message>
Finished/tested 'recordation' merge on Azure
</commit_message>
<xml_diff>
--- a/project/documents/miscellaneous/recordationcoversheet.docx
+++ b/project/documents/miscellaneous/recordationcoversheet.docx
@@ -1,6 +1,6 @@
 
 <file path=word/document.xml><?xml version="1.0" encoding="utf-8"?>
-<w:document xmlns:wpc="http://schemas.microsoft.com/office/word/2010/wordprocessingCanvas" xmlns:cx="http://schemas.microsoft.com/office/drawing/2014/chartex" xmlns:cx1="http://schemas.microsoft.com/office/drawing/2015/9/8/chartex" xmlns:cx2="http://schemas.microsoft.com/office/drawing/2015/10/21/chartex" xmlns:cx3="http://schemas.microsoft.com/office/drawing/2016/5/9/chartex" xmlns:cx4="http://schemas.microsoft.com/office/drawing/2016/5/10/chartex" xmlns:cx5="http://schemas.microsoft.com/office/drawing/2016/5/11/chartex" xmlns:cx6="http://schemas.microsoft.com/office/drawing/2016/5/12/chartex" xmlns:cx7="http://schemas.microsoft.com/office/drawing/2016/5/13/chartex" xmlns:cx8="http://schemas.microsoft.com/office/drawing/2016/5/14/chartex" xmlns:mc="http://schemas.openxmlformats.org/markup-compatibility/2006" xmlns:aink="http://schemas.microsoft.com/office/drawing/2016/ink" xmlns:am3d="http://schemas.microsoft.com/office/drawing/2017/model3d" xmlns:o="urn:schemas-microsoft-com:office:office" xmlns:oel="http://schemas.microsoft.com/office/2019/extlst" xmlns:r="http://schemas.openxmlformats.org/officeDocument/2006/relationships" xmlns:m="http://schemas.openxmlformats.org/officeDocument/2006/math" xmlns:v="urn:schemas-microsoft-com:vml" xmlns:wp14="http://schemas.microsoft.com/office/word/2010/wordprocessingDrawing" xmlns:wp="http://schemas.openxmlformats.org/drawingml/2006/wordprocessingDrawing" xmlns:w10="urn:schemas-microsoft-com:office:word" xmlns:w="http://schemas.openxmlformats.org/wordprocessingml/2006/main" xmlns:w14="http://schemas.microsoft.com/office/word/2010/wordml" xmlns:w15="http://schemas.microsoft.com/office/word/2012/wordml" xmlns:w16cex="http://schemas.microsoft.com/office/word/2018/wordml/cex" xmlns:w16cid="http://schemas.microsoft.com/office/word/2016/wordml/cid" xmlns:w16="http://schemas.microsoft.com/office/word/2018/wordml" xmlns:w16sdtdh="http://schemas.microsoft.com/office/word/2020/wordml/sdtdatahash" xmlns:w16se="http://schemas.microsoft.com/office/word/2015/wordml/symex" xmlns:wpg="http://schemas.microsoft.com/office/word/2010/wordprocessingGroup" xmlns:wpi="http://schemas.microsoft.com/office/word/2010/wordprocessingInk" xmlns:wne="http://schemas.microsoft.com/office/word/2006/wordml" xmlns:wps="http://schemas.microsoft.com/office/word/2010/wordprocessingShape" mc:Ignorable="w14 w15 w16se w16cid w16 w16cex w16sdtdh wp14">
+<w:document xmlns:wpc="http://schemas.microsoft.com/office/word/2010/wordprocessingCanvas" xmlns:cx="http://schemas.microsoft.com/office/drawing/2014/chartex" xmlns:cx1="http://schemas.microsoft.com/office/drawing/2015/9/8/chartex" xmlns:cx2="http://schemas.microsoft.com/office/drawing/2015/10/21/chartex" xmlns:cx3="http://schemas.microsoft.com/office/drawing/2016/5/9/chartex" xmlns:cx4="http://schemas.microsoft.com/office/drawing/2016/5/10/chartex" xmlns:cx5="http://schemas.microsoft.com/office/drawing/2016/5/11/chartex" xmlns:cx6="http://schemas.microsoft.com/office/drawing/2016/5/12/chartex" xmlns:cx7="http://schemas.microsoft.com/office/drawing/2016/5/13/chartex" xmlns:cx8="http://schemas.microsoft.com/office/drawing/2016/5/14/chartex" xmlns:mc="http://schemas.openxmlformats.org/markup-compatibility/2006" xmlns:aink="http://schemas.microsoft.com/office/drawing/2016/ink" xmlns:am3d="http://schemas.microsoft.com/office/drawing/2017/model3d" xmlns:o="urn:schemas-microsoft-com:office:office" xmlns:oel="http://schemas.microsoft.com/office/2019/extlst" xmlns:r="http://schemas.openxmlformats.org/officeDocument/2006/relationships" xmlns:m="http://schemas.openxmlformats.org/officeDocument/2006/math" xmlns:v="urn:schemas-microsoft-com:vml" xmlns:wp14="http://schemas.microsoft.com/office/word/2010/wordprocessingDrawing" xmlns:wp="http://schemas.openxmlformats.org/drawingml/2006/wordprocessingDrawing" xmlns:w10="urn:schemas-microsoft-com:office:word" xmlns:w="http://schemas.openxmlformats.org/wordprocessingml/2006/main" xmlns:w14="http://schemas.microsoft.com/office/word/2010/wordml" xmlns:w15="http://schemas.microsoft.com/office/word/2012/wordml" xmlns:w16cex="http://schemas.microsoft.com/office/word/2018/wordml/cex" xmlns:w16cid="http://schemas.microsoft.com/office/word/2016/wordml/cid" xmlns:w16="http://schemas.microsoft.com/office/word/2018/wordml" xmlns:w16du="http://schemas.microsoft.com/office/word/2023/wordml/word16du" xmlns:w16sdtdh="http://schemas.microsoft.com/office/word/2020/wordml/sdtdatahash" xmlns:w16sdtfl="http://schemas.microsoft.com/office/word/2024/wordml/sdtformatlock" xmlns:w16se="http://schemas.microsoft.com/office/word/2015/wordml/symex" xmlns:wpg="http://schemas.microsoft.com/office/word/2010/wordprocessingGroup" xmlns:wpi="http://schemas.microsoft.com/office/word/2010/wordprocessingInk" xmlns:wne="http://schemas.microsoft.com/office/word/2006/wordml" xmlns:wps="http://schemas.microsoft.com/office/word/2010/wordprocessingShape" mc:Ignorable="w14 w15 w16se w16cid w16 w16cex w16sdtdh w16sdtfl w16du wp14">
   <w:body>
     <w:p>
       <w:pPr>
@@ -675,13 +675,23 @@
           <w:szCs w:val="16"/>
         </w:rPr>
       </w:pPr>
-      <w:r>
-        <w:rPr>
-          <w:rFonts w:ascii="Times New Roman" w:hAnsi="Times New Roman"/>
-          <w:sz w:val="22"/>
-          <w:szCs w:val="16"/>
-        </w:rPr>
-        <w:t>[  ]Yes [X]No</w:t>
+      <w:proofErr w:type="gramStart"/>
+      <w:r>
+        <w:rPr>
+          <w:rFonts w:ascii="Times New Roman" w:hAnsi="Times New Roman"/>
+          <w:sz w:val="22"/>
+          <w:szCs w:val="16"/>
+        </w:rPr>
+        <w:t>[  ]</w:t>
+      </w:r>
+      <w:proofErr w:type="gramEnd"/>
+      <w:r>
+        <w:rPr>
+          <w:rFonts w:ascii="Times New Roman" w:hAnsi="Times New Roman"/>
+          <w:sz w:val="22"/>
+          <w:szCs w:val="16"/>
+        </w:rPr>
+        <w:t>Yes [X]No</w:t>
       </w:r>
     </w:p>
     <w:p>
@@ -840,6 +850,7 @@
         </w:rPr>
         <w:tab/>
       </w:r>
+      <w:proofErr w:type="gramStart"/>
       <w:r>
         <w:rPr>
           <w:rFonts w:ascii="Times New Roman" w:hAnsi="Times New Roman"/>
@@ -862,7 +873,16 @@
           <w:sz w:val="22"/>
           <w:szCs w:val="16"/>
         </w:rPr>
-        <w:t>[  ]  Merger</w:t>
+        <w:t>[</w:t>
+      </w:r>
+      <w:proofErr w:type="gramEnd"/>
+      <w:r>
+        <w:rPr>
+          <w:rFonts w:ascii="Times New Roman" w:hAnsi="Times New Roman"/>
+          <w:sz w:val="22"/>
+          <w:szCs w:val="16"/>
+        </w:rPr>
+        <w:t xml:space="preserve">  ]  Merger</w:t>
       </w:r>
     </w:p>
     <w:p>
@@ -875,13 +895,23 @@
           <w:szCs w:val="16"/>
         </w:rPr>
       </w:pPr>
-      <w:r>
-        <w:rPr>
-          <w:rFonts w:ascii="Times New Roman" w:hAnsi="Times New Roman"/>
-          <w:sz w:val="22"/>
-          <w:szCs w:val="16"/>
-        </w:rPr>
-        <w:t>[  ]  Security Agreement</w:t>
+      <w:proofErr w:type="gramStart"/>
+      <w:r>
+        <w:rPr>
+          <w:rFonts w:ascii="Times New Roman" w:hAnsi="Times New Roman"/>
+          <w:sz w:val="22"/>
+          <w:szCs w:val="16"/>
+        </w:rPr>
+        <w:t>[  ]</w:t>
+      </w:r>
+      <w:proofErr w:type="gramEnd"/>
+      <w:r>
+        <w:rPr>
+          <w:rFonts w:ascii="Times New Roman" w:hAnsi="Times New Roman"/>
+          <w:sz w:val="22"/>
+          <w:szCs w:val="16"/>
+        </w:rPr>
+        <w:t xml:space="preserve">  Security Agreement</w:t>
       </w:r>
       <w:r>
         <w:rPr>
@@ -918,13 +948,23 @@
           <w:szCs w:val="16"/>
         </w:rPr>
       </w:pPr>
-      <w:r>
-        <w:rPr>
-          <w:rFonts w:ascii="Times New Roman" w:hAnsi="Times New Roman"/>
-          <w:sz w:val="22"/>
-          <w:szCs w:val="16"/>
-        </w:rPr>
-        <w:t>[  ]  Joint Research Agreement</w:t>
+      <w:proofErr w:type="gramStart"/>
+      <w:r>
+        <w:rPr>
+          <w:rFonts w:ascii="Times New Roman" w:hAnsi="Times New Roman"/>
+          <w:sz w:val="22"/>
+          <w:szCs w:val="16"/>
+        </w:rPr>
+        <w:t>[  ]</w:t>
+      </w:r>
+      <w:proofErr w:type="gramEnd"/>
+      <w:r>
+        <w:rPr>
+          <w:rFonts w:ascii="Times New Roman" w:hAnsi="Times New Roman"/>
+          <w:sz w:val="22"/>
+          <w:szCs w:val="16"/>
+        </w:rPr>
+        <w:t xml:space="preserve">  Joint Research Agreement</w:t>
       </w:r>
     </w:p>
     <w:p>
@@ -937,13 +977,23 @@
           <w:szCs w:val="16"/>
         </w:rPr>
       </w:pPr>
-      <w:r>
-        <w:rPr>
-          <w:rFonts w:ascii="Times New Roman" w:hAnsi="Times New Roman"/>
-          <w:sz w:val="22"/>
-          <w:szCs w:val="16"/>
-        </w:rPr>
-        <w:t>[  ]  Government Interest Assignment</w:t>
+      <w:proofErr w:type="gramStart"/>
+      <w:r>
+        <w:rPr>
+          <w:rFonts w:ascii="Times New Roman" w:hAnsi="Times New Roman"/>
+          <w:sz w:val="22"/>
+          <w:szCs w:val="16"/>
+        </w:rPr>
+        <w:t>[  ]</w:t>
+      </w:r>
+      <w:proofErr w:type="gramEnd"/>
+      <w:r>
+        <w:rPr>
+          <w:rFonts w:ascii="Times New Roman" w:hAnsi="Times New Roman"/>
+          <w:sz w:val="22"/>
+          <w:szCs w:val="16"/>
+        </w:rPr>
+        <w:t xml:space="preserve">  Government Interest Assignment</w:t>
       </w:r>
     </w:p>
     <w:p>
@@ -956,13 +1006,23 @@
           <w:szCs w:val="16"/>
         </w:rPr>
       </w:pPr>
-      <w:r>
-        <w:rPr>
-          <w:rFonts w:ascii="Times New Roman" w:hAnsi="Times New Roman"/>
-          <w:sz w:val="22"/>
-          <w:szCs w:val="16"/>
-        </w:rPr>
-        <w:t>[  ]  Executive Order 9424, Confirmatory License</w:t>
+      <w:proofErr w:type="gramStart"/>
+      <w:r>
+        <w:rPr>
+          <w:rFonts w:ascii="Times New Roman" w:hAnsi="Times New Roman"/>
+          <w:sz w:val="22"/>
+          <w:szCs w:val="16"/>
+        </w:rPr>
+        <w:t>[  ]</w:t>
+      </w:r>
+      <w:proofErr w:type="gramEnd"/>
+      <w:r>
+        <w:rPr>
+          <w:rFonts w:ascii="Times New Roman" w:hAnsi="Times New Roman"/>
+          <w:sz w:val="22"/>
+          <w:szCs w:val="16"/>
+        </w:rPr>
+        <w:t xml:space="preserve">  Executive Order 9424, Confirmatory License</w:t>
       </w:r>
     </w:p>
     <w:p>
@@ -975,13 +1035,23 @@
           <w:szCs w:val="16"/>
         </w:rPr>
       </w:pPr>
-      <w:r>
-        <w:rPr>
-          <w:rFonts w:ascii="Times New Roman" w:hAnsi="Times New Roman"/>
-          <w:sz w:val="22"/>
-          <w:szCs w:val="16"/>
-        </w:rPr>
-        <w:t xml:space="preserve">[  ]  Other </w:t>
+      <w:proofErr w:type="gramStart"/>
+      <w:r>
+        <w:rPr>
+          <w:rFonts w:ascii="Times New Roman" w:hAnsi="Times New Roman"/>
+          <w:sz w:val="22"/>
+          <w:szCs w:val="16"/>
+        </w:rPr>
+        <w:t>[  ]</w:t>
+      </w:r>
+      <w:proofErr w:type="gramEnd"/>
+      <w:r>
+        <w:rPr>
+          <w:rFonts w:ascii="Times New Roman" w:hAnsi="Times New Roman"/>
+          <w:sz w:val="22"/>
+          <w:szCs w:val="16"/>
+        </w:rPr>
+        <w:t xml:space="preserve">  Other </w:t>
       </w:r>
     </w:p>
     <w:p>
@@ -1475,88 +1545,57 @@
           <w:sz w:val="22"/>
           <w:szCs w:val="16"/>
         </w:rPr>
-        <w:t xml:space="preserve"> </w:t>
-      </w:r>
-      <w:sdt>
-        <w:sdtPr>
-          <w:rPr>
-            <w:sz w:val="22"/>
-            <w:szCs w:val="22"/>
-          </w:rPr>
-          <w:id w:val="-1950309988"/>
-          <w14:checkbox>
-            <w14:checked w14:val="0"/>
-            <w14:checkedState w14:val="2612" w14:font="MS Gothic"/>
-            <w14:uncheckedState w14:val="2610" w14:font="MS Gothic"/>
-          </w14:checkbox>
-        </w:sdtPr>
-        <w:sdtEndPr/>
-        <w:sdtContent>
-          <w:r>
-            <w:rPr>
-              <w:rFonts w:ascii="MS Gothic" w:eastAsia="MS Gothic" w:hAnsi="MS Gothic" w:hint="eastAsia"/>
-              <w:sz w:val="22"/>
-              <w:szCs w:val="22"/>
-            </w:rPr>
-            <w:t>☐</w:t>
-          </w:r>
-        </w:sdtContent>
-      </w:sdt>
-      <w:r>
-        <w:rPr>
-          <w:rFonts w:ascii="Times New Roman" w:hAnsi="Times New Roman"/>
-          <w:sz w:val="22"/>
-          <w:szCs w:val="16"/>
-        </w:rPr>
-        <w:t xml:space="preserve">Yes </w:t>
-      </w:r>
-      <w:r>
-        <w:rPr>
-          <w:sz w:val="22"/>
-          <w:szCs w:val="22"/>
-        </w:rPr>
-        <w:t xml:space="preserve">   </w:t>
-      </w:r>
-      <w:sdt>
-        <w:sdtPr>
-          <w:rPr>
-            <w:sz w:val="22"/>
-            <w:szCs w:val="22"/>
-          </w:rPr>
-          <w:id w:val="-1543281240"/>
-          <w14:checkbox>
-            <w14:checked w14:val="0"/>
-            <w14:checkedState w14:val="2612" w14:font="MS Gothic"/>
-            <w14:uncheckedState w14:val="2610" w14:font="MS Gothic"/>
-          </w14:checkbox>
-        </w:sdtPr>
-        <w:sdtEndPr/>
-        <w:sdtContent>
-          <w:r>
-            <w:rPr>
-              <w:rFonts w:ascii="MS Gothic" w:eastAsia="MS Gothic" w:hAnsi="MS Gothic" w:hint="eastAsia"/>
-              <w:sz w:val="22"/>
-              <w:szCs w:val="22"/>
-            </w:rPr>
-            <w:t>☐</w:t>
-          </w:r>
-        </w:sdtContent>
-      </w:sdt>
-      <w:r>
-        <w:rPr>
-          <w:rFonts w:eastAsia="MS Gothic"/>
-          <w:sz w:val="22"/>
-          <w:szCs w:val="22"/>
-        </w:rPr>
-        <w:t xml:space="preserve"> </w:t>
-      </w:r>
-      <w:r>
-        <w:rPr>
-          <w:rFonts w:ascii="Times New Roman" w:hAnsi="Times New Roman"/>
-          <w:sz w:val="22"/>
-          <w:szCs w:val="16"/>
-        </w:rPr>
-        <w:t>No</w:t>
+        <w:t>[</w:t>
+      </w:r>
+      <w:r>
+        <w:rPr>
+          <w:rFonts w:ascii="Times New Roman" w:hAnsi="Times New Roman"/>
+          <w:sz w:val="22"/>
+          <w:szCs w:val="16"/>
+        </w:rPr>
+        <w:t>&lt;&lt;addRecY&gt;</w:t>
+      </w:r>
+      <w:proofErr w:type="gramStart"/>
+      <w:r>
+        <w:rPr>
+          <w:rFonts w:ascii="Times New Roman" w:hAnsi="Times New Roman"/>
+          <w:sz w:val="22"/>
+          <w:szCs w:val="16"/>
+        </w:rPr>
+        <w:t>&gt;</w:t>
+      </w:r>
+      <w:r>
+        <w:rPr>
+          <w:rFonts w:ascii="Times New Roman" w:hAnsi="Times New Roman"/>
+          <w:sz w:val="22"/>
+          <w:szCs w:val="16"/>
+        </w:rPr>
+        <w:t>]Yes</w:t>
+      </w:r>
+      <w:proofErr w:type="gramEnd"/>
+      <w:r>
+        <w:rPr>
+          <w:rFonts w:ascii="Times New Roman" w:hAnsi="Times New Roman"/>
+          <w:sz w:val="22"/>
+          <w:szCs w:val="16"/>
+        </w:rPr>
+        <w:t xml:space="preserve"> [</w:t>
+      </w:r>
+      <w:r>
+        <w:rPr>
+          <w:rFonts w:ascii="Times New Roman" w:hAnsi="Times New Roman"/>
+          <w:sz w:val="22"/>
+          <w:szCs w:val="16"/>
+        </w:rPr>
+        <w:t>&lt;&lt;addRecN&gt;&gt;</w:t>
+      </w:r>
+      <w:r>
+        <w:rPr>
+          <w:rFonts w:ascii="Times New Roman" w:hAnsi="Times New Roman"/>
+          <w:sz w:val="22"/>
+          <w:szCs w:val="16"/>
+        </w:rPr>
+        <w:t>]No</w:t>
       </w:r>
     </w:p>
     <w:p>
@@ -1742,12 +1781,14 @@
         </w:rPr>
         <w:tab/>
       </w:r>
+      <w:proofErr w:type="gramStart"/>
       <w:r>
         <w:rPr>
           <w:sz w:val="22"/>
         </w:rPr>
         <w:t>[  ]</w:t>
       </w:r>
+      <w:proofErr w:type="gramEnd"/>
       <w:r>
         <w:rPr>
           <w:rFonts w:eastAsia="MS Gothic"/>
@@ -1983,7 +2024,21 @@
         <w:rPr>
           <w:sz w:val="22"/>
         </w:rPr>
-        <w:t>Additional numbers attached?  [  ]Yes  [X]No</w:t>
+        <w:t xml:space="preserve">Additional numbers attached?  </w:t>
+      </w:r>
+      <w:proofErr w:type="gramStart"/>
+      <w:r>
+        <w:rPr>
+          <w:sz w:val="22"/>
+        </w:rPr>
+        <w:t>[  ]</w:t>
+      </w:r>
+      <w:proofErr w:type="gramEnd"/>
+      <w:r>
+        <w:rPr>
+          <w:sz w:val="22"/>
+        </w:rPr>
+        <w:t>Yes  [X]No</w:t>
       </w:r>
     </w:p>
     <w:p>
@@ -2680,7 +2735,25 @@
           <w:sz w:val="22"/>
           <w:szCs w:val="16"/>
         </w:rPr>
-        <w:t xml:space="preserve">Authorized User Name: </w:t>
+        <w:t xml:space="preserve">Authorized </w:t>
+      </w:r>
+      <w:proofErr w:type="gramStart"/>
+      <w:r>
+        <w:rPr>
+          <w:rFonts w:ascii="Times New Roman" w:hAnsi="Times New Roman"/>
+          <w:sz w:val="22"/>
+          <w:szCs w:val="16"/>
+        </w:rPr>
+        <w:t>User Name</w:t>
+      </w:r>
+      <w:proofErr w:type="gramEnd"/>
+      <w:r>
+        <w:rPr>
+          <w:rFonts w:ascii="Times New Roman" w:hAnsi="Times New Roman"/>
+          <w:sz w:val="22"/>
+          <w:szCs w:val="16"/>
+        </w:rPr>
+        <w:t xml:space="preserve">: </w:t>
       </w:r>
       <w:r>
         <w:rPr>
@@ -3498,7 +3571,7 @@
 </file>
 
 <file path=word/endnotes.xml><?xml version="1.0" encoding="utf-8"?>
-<w:endnotes xmlns:wpc="http://schemas.microsoft.com/office/word/2010/wordprocessingCanvas" xmlns:cx="http://schemas.microsoft.com/office/drawing/2014/chartex" xmlns:cx1="http://schemas.microsoft.com/office/drawing/2015/9/8/chartex" xmlns:cx2="http://schemas.microsoft.com/office/drawing/2015/10/21/chartex" xmlns:cx3="http://schemas.microsoft.com/office/drawing/2016/5/9/chartex" xmlns:cx4="http://schemas.microsoft.com/office/drawing/2016/5/10/chartex" xmlns:cx5="http://schemas.microsoft.com/office/drawing/2016/5/11/chartex" xmlns:cx6="http://schemas.microsoft.com/office/drawing/2016/5/12/chartex" xmlns:cx7="http://schemas.microsoft.com/office/drawing/2016/5/13/chartex" xmlns:cx8="http://schemas.microsoft.com/office/drawing/2016/5/14/chartex" xmlns:mc="http://schemas.openxmlformats.org/markup-compatibility/2006" xmlns:aink="http://schemas.microsoft.com/office/drawing/2016/ink" xmlns:am3d="http://schemas.microsoft.com/office/drawing/2017/model3d" xmlns:o="urn:schemas-microsoft-com:office:office" xmlns:oel="http://schemas.microsoft.com/office/2019/extlst" xmlns:r="http://schemas.openxmlformats.org/officeDocument/2006/relationships" xmlns:m="http://schemas.openxmlformats.org/officeDocument/2006/math" xmlns:v="urn:schemas-microsoft-com:vml" xmlns:wp14="http://schemas.microsoft.com/office/word/2010/wordprocessingDrawing" xmlns:wp="http://schemas.openxmlformats.org/drawingml/2006/wordprocessingDrawing" xmlns:w10="urn:schemas-microsoft-com:office:word" xmlns:w="http://schemas.openxmlformats.org/wordprocessingml/2006/main" xmlns:w14="http://schemas.microsoft.com/office/word/2010/wordml" xmlns:w15="http://schemas.microsoft.com/office/word/2012/wordml" xmlns:w16cex="http://schemas.microsoft.com/office/word/2018/wordml/cex" xmlns:w16cid="http://schemas.microsoft.com/office/word/2016/wordml/cid" xmlns:w16="http://schemas.microsoft.com/office/word/2018/wordml" xmlns:w16sdtdh="http://schemas.microsoft.com/office/word/2020/wordml/sdtdatahash" xmlns:w16se="http://schemas.microsoft.com/office/word/2015/wordml/symex" xmlns:wpg="http://schemas.microsoft.com/office/word/2010/wordprocessingGroup" xmlns:wpi="http://schemas.microsoft.com/office/word/2010/wordprocessingInk" xmlns:wne="http://schemas.microsoft.com/office/word/2006/wordml" xmlns:wps="http://schemas.microsoft.com/office/word/2010/wordprocessingShape" mc:Ignorable="w14 w15 w16se w16cid w16 w16cex w16sdtdh wp14">
+<w:endnotes xmlns:wpc="http://schemas.microsoft.com/office/word/2010/wordprocessingCanvas" xmlns:cx="http://schemas.microsoft.com/office/drawing/2014/chartex" xmlns:cx1="http://schemas.microsoft.com/office/drawing/2015/9/8/chartex" xmlns:cx2="http://schemas.microsoft.com/office/drawing/2015/10/21/chartex" xmlns:cx3="http://schemas.microsoft.com/office/drawing/2016/5/9/chartex" xmlns:cx4="http://schemas.microsoft.com/office/drawing/2016/5/10/chartex" xmlns:cx5="http://schemas.microsoft.com/office/drawing/2016/5/11/chartex" xmlns:cx6="http://schemas.microsoft.com/office/drawing/2016/5/12/chartex" xmlns:cx7="http://schemas.microsoft.com/office/drawing/2016/5/13/chartex" xmlns:cx8="http://schemas.microsoft.com/office/drawing/2016/5/14/chartex" xmlns:mc="http://schemas.openxmlformats.org/markup-compatibility/2006" xmlns:aink="http://schemas.microsoft.com/office/drawing/2016/ink" xmlns:am3d="http://schemas.microsoft.com/office/drawing/2017/model3d" xmlns:o="urn:schemas-microsoft-com:office:office" xmlns:oel="http://schemas.microsoft.com/office/2019/extlst" xmlns:r="http://schemas.openxmlformats.org/officeDocument/2006/relationships" xmlns:m="http://schemas.openxmlformats.org/officeDocument/2006/math" xmlns:v="urn:schemas-microsoft-com:vml" xmlns:wp14="http://schemas.microsoft.com/office/word/2010/wordprocessingDrawing" xmlns:wp="http://schemas.openxmlformats.org/drawingml/2006/wordprocessingDrawing" xmlns:w10="urn:schemas-microsoft-com:office:word" xmlns:w="http://schemas.openxmlformats.org/wordprocessingml/2006/main" xmlns:w14="http://schemas.microsoft.com/office/word/2010/wordml" xmlns:w15="http://schemas.microsoft.com/office/word/2012/wordml" xmlns:w16cex="http://schemas.microsoft.com/office/word/2018/wordml/cex" xmlns:w16cid="http://schemas.microsoft.com/office/word/2016/wordml/cid" xmlns:w16="http://schemas.microsoft.com/office/word/2018/wordml" xmlns:w16du="http://schemas.microsoft.com/office/word/2023/wordml/word16du" xmlns:w16sdtdh="http://schemas.microsoft.com/office/word/2020/wordml/sdtdatahash" xmlns:w16sdtfl="http://schemas.microsoft.com/office/word/2024/wordml/sdtformatlock" xmlns:w16se="http://schemas.microsoft.com/office/word/2015/wordml/symex" xmlns:wpg="http://schemas.microsoft.com/office/word/2010/wordprocessingGroup" xmlns:wpi="http://schemas.microsoft.com/office/word/2010/wordprocessingInk" xmlns:wne="http://schemas.microsoft.com/office/word/2006/wordml" xmlns:wps="http://schemas.microsoft.com/office/word/2010/wordprocessingShape" mc:Ignorable="w14 w15 w16se w16cid w16 w16cex w16sdtdh w16sdtfl w16du wp14">
   <w:endnote w:type="separator" w:id="-1">
     <w:p>
       <w:r>
@@ -3517,7 +3590,7 @@
 </file>
 
 <file path=word/footer1.xml><?xml version="1.0" encoding="utf-8"?>
-<w:ftr xmlns:wpc="http://schemas.microsoft.com/office/word/2010/wordprocessingCanvas" xmlns:cx="http://schemas.microsoft.com/office/drawing/2014/chartex" xmlns:cx1="http://schemas.microsoft.com/office/drawing/2015/9/8/chartex" xmlns:cx2="http://schemas.microsoft.com/office/drawing/2015/10/21/chartex" xmlns:cx3="http://schemas.microsoft.com/office/drawing/2016/5/9/chartex" xmlns:cx4="http://schemas.microsoft.com/office/drawing/2016/5/10/chartex" xmlns:cx5="http://schemas.microsoft.com/office/drawing/2016/5/11/chartex" xmlns:cx6="http://schemas.microsoft.com/office/drawing/2016/5/12/chartex" xmlns:cx7="http://schemas.microsoft.com/office/drawing/2016/5/13/chartex" xmlns:cx8="http://schemas.microsoft.com/office/drawing/2016/5/14/chartex" xmlns:mc="http://schemas.openxmlformats.org/markup-compatibility/2006" xmlns:aink="http://schemas.microsoft.com/office/drawing/2016/ink" xmlns:am3d="http://schemas.microsoft.com/office/drawing/2017/model3d" xmlns:o="urn:schemas-microsoft-com:office:office" xmlns:oel="http://schemas.microsoft.com/office/2019/extlst" xmlns:r="http://schemas.openxmlformats.org/officeDocument/2006/relationships" xmlns:m="http://schemas.openxmlformats.org/officeDocument/2006/math" xmlns:v="urn:schemas-microsoft-com:vml" xmlns:wp14="http://schemas.microsoft.com/office/word/2010/wordprocessingDrawing" xmlns:wp="http://schemas.openxmlformats.org/drawingml/2006/wordprocessingDrawing" xmlns:w10="urn:schemas-microsoft-com:office:word" xmlns:w="http://schemas.openxmlformats.org/wordprocessingml/2006/main" xmlns:w14="http://schemas.microsoft.com/office/word/2010/wordml" xmlns:w15="http://schemas.microsoft.com/office/word/2012/wordml" xmlns:w16cex="http://schemas.microsoft.com/office/word/2018/wordml/cex" xmlns:w16cid="http://schemas.microsoft.com/office/word/2016/wordml/cid" xmlns:w16="http://schemas.microsoft.com/office/word/2018/wordml" xmlns:w16sdtdh="http://schemas.microsoft.com/office/word/2020/wordml/sdtdatahash" xmlns:w16se="http://schemas.microsoft.com/office/word/2015/wordml/symex" xmlns:wpg="http://schemas.microsoft.com/office/word/2010/wordprocessingGroup" xmlns:wpi="http://schemas.microsoft.com/office/word/2010/wordprocessingInk" xmlns:wne="http://schemas.microsoft.com/office/word/2006/wordml" xmlns:wps="http://schemas.microsoft.com/office/word/2010/wordprocessingShape" mc:Ignorable="w14 w15 w16se w16cid w16 w16cex w16sdtdh wp14">
+<w:ftr xmlns:wpc="http://schemas.microsoft.com/office/word/2010/wordprocessingCanvas" xmlns:cx="http://schemas.microsoft.com/office/drawing/2014/chartex" xmlns:cx1="http://schemas.microsoft.com/office/drawing/2015/9/8/chartex" xmlns:cx2="http://schemas.microsoft.com/office/drawing/2015/10/21/chartex" xmlns:cx3="http://schemas.microsoft.com/office/drawing/2016/5/9/chartex" xmlns:cx4="http://schemas.microsoft.com/office/drawing/2016/5/10/chartex" xmlns:cx5="http://schemas.microsoft.com/office/drawing/2016/5/11/chartex" xmlns:cx6="http://schemas.microsoft.com/office/drawing/2016/5/12/chartex" xmlns:cx7="http://schemas.microsoft.com/office/drawing/2016/5/13/chartex" xmlns:cx8="http://schemas.microsoft.com/office/drawing/2016/5/14/chartex" xmlns:mc="http://schemas.openxmlformats.org/markup-compatibility/2006" xmlns:aink="http://schemas.microsoft.com/office/drawing/2016/ink" xmlns:am3d="http://schemas.microsoft.com/office/drawing/2017/model3d" xmlns:o="urn:schemas-microsoft-com:office:office" xmlns:oel="http://schemas.microsoft.com/office/2019/extlst" xmlns:r="http://schemas.openxmlformats.org/officeDocument/2006/relationships" xmlns:m="http://schemas.openxmlformats.org/officeDocument/2006/math" xmlns:v="urn:schemas-microsoft-com:vml" xmlns:wp14="http://schemas.microsoft.com/office/word/2010/wordprocessingDrawing" xmlns:wp="http://schemas.openxmlformats.org/drawingml/2006/wordprocessingDrawing" xmlns:w10="urn:schemas-microsoft-com:office:word" xmlns:w="http://schemas.openxmlformats.org/wordprocessingml/2006/main" xmlns:w14="http://schemas.microsoft.com/office/word/2010/wordml" xmlns:w15="http://schemas.microsoft.com/office/word/2012/wordml" xmlns:w16cex="http://schemas.microsoft.com/office/word/2018/wordml/cex" xmlns:w16cid="http://schemas.microsoft.com/office/word/2016/wordml/cid" xmlns:w16="http://schemas.microsoft.com/office/word/2018/wordml" xmlns:w16du="http://schemas.microsoft.com/office/word/2023/wordml/word16du" xmlns:w16sdtdh="http://schemas.microsoft.com/office/word/2020/wordml/sdtdatahash" xmlns:w16sdtfl="http://schemas.microsoft.com/office/word/2024/wordml/sdtformatlock" xmlns:w16se="http://schemas.microsoft.com/office/word/2015/wordml/symex" xmlns:wpg="http://schemas.microsoft.com/office/word/2010/wordprocessingGroup" xmlns:wpi="http://schemas.microsoft.com/office/word/2010/wordprocessingInk" xmlns:wne="http://schemas.microsoft.com/office/word/2006/wordml" xmlns:wps="http://schemas.microsoft.com/office/word/2010/wordprocessingShape" mc:Ignorable="w14 w15 w16se w16cid w16 w16cex w16sdtdh w16sdtfl w16du wp14">
   <w:p>
     <w:pPr>
       <w:pStyle w:val="Footer"/>
@@ -3527,7 +3600,7 @@
 </file>
 
 <file path=word/footer2.xml><?xml version="1.0" encoding="utf-8"?>
-<w:ftr xmlns:wpc="http://schemas.microsoft.com/office/word/2010/wordprocessingCanvas" xmlns:cx="http://schemas.microsoft.com/office/drawing/2014/chartex" xmlns:cx1="http://schemas.microsoft.com/office/drawing/2015/9/8/chartex" xmlns:cx2="http://schemas.microsoft.com/office/drawing/2015/10/21/chartex" xmlns:cx3="http://schemas.microsoft.com/office/drawing/2016/5/9/chartex" xmlns:cx4="http://schemas.microsoft.com/office/drawing/2016/5/10/chartex" xmlns:cx5="http://schemas.microsoft.com/office/drawing/2016/5/11/chartex" xmlns:cx6="http://schemas.microsoft.com/office/drawing/2016/5/12/chartex" xmlns:cx7="http://schemas.microsoft.com/office/drawing/2016/5/13/chartex" xmlns:cx8="http://schemas.microsoft.com/office/drawing/2016/5/14/chartex" xmlns:mc="http://schemas.openxmlformats.org/markup-compatibility/2006" xmlns:aink="http://schemas.microsoft.com/office/drawing/2016/ink" xmlns:am3d="http://schemas.microsoft.com/office/drawing/2017/model3d" xmlns:o="urn:schemas-microsoft-com:office:office" xmlns:oel="http://schemas.microsoft.com/office/2019/extlst" xmlns:r="http://schemas.openxmlformats.org/officeDocument/2006/relationships" xmlns:m="http://schemas.openxmlformats.org/officeDocument/2006/math" xmlns:v="urn:schemas-microsoft-com:vml" xmlns:wp14="http://schemas.microsoft.com/office/word/2010/wordprocessingDrawing" xmlns:wp="http://schemas.openxmlformats.org/drawingml/2006/wordprocessingDrawing" xmlns:w10="urn:schemas-microsoft-com:office:word" xmlns:w="http://schemas.openxmlformats.org/wordprocessingml/2006/main" xmlns:w14="http://schemas.microsoft.com/office/word/2010/wordml" xmlns:w15="http://schemas.microsoft.com/office/word/2012/wordml" xmlns:w16cex="http://schemas.microsoft.com/office/word/2018/wordml/cex" xmlns:w16cid="http://schemas.microsoft.com/office/word/2016/wordml/cid" xmlns:w16="http://schemas.microsoft.com/office/word/2018/wordml" xmlns:w16sdtdh="http://schemas.microsoft.com/office/word/2020/wordml/sdtdatahash" xmlns:w16se="http://schemas.microsoft.com/office/word/2015/wordml/symex" xmlns:wpg="http://schemas.microsoft.com/office/word/2010/wordprocessingGroup" xmlns:wpi="http://schemas.microsoft.com/office/word/2010/wordprocessingInk" xmlns:wne="http://schemas.microsoft.com/office/word/2006/wordml" xmlns:wps="http://schemas.microsoft.com/office/word/2010/wordprocessingShape" mc:Ignorable="w14 w15 w16se w16cid w16 w16cex w16sdtdh wp14">
+<w:ftr xmlns:wpc="http://schemas.microsoft.com/office/word/2010/wordprocessingCanvas" xmlns:cx="http://schemas.microsoft.com/office/drawing/2014/chartex" xmlns:cx1="http://schemas.microsoft.com/office/drawing/2015/9/8/chartex" xmlns:cx2="http://schemas.microsoft.com/office/drawing/2015/10/21/chartex" xmlns:cx3="http://schemas.microsoft.com/office/drawing/2016/5/9/chartex" xmlns:cx4="http://schemas.microsoft.com/office/drawing/2016/5/10/chartex" xmlns:cx5="http://schemas.microsoft.com/office/drawing/2016/5/11/chartex" xmlns:cx6="http://schemas.microsoft.com/office/drawing/2016/5/12/chartex" xmlns:cx7="http://schemas.microsoft.com/office/drawing/2016/5/13/chartex" xmlns:cx8="http://schemas.microsoft.com/office/drawing/2016/5/14/chartex" xmlns:mc="http://schemas.openxmlformats.org/markup-compatibility/2006" xmlns:aink="http://schemas.microsoft.com/office/drawing/2016/ink" xmlns:am3d="http://schemas.microsoft.com/office/drawing/2017/model3d" xmlns:o="urn:schemas-microsoft-com:office:office" xmlns:oel="http://schemas.microsoft.com/office/2019/extlst" xmlns:r="http://schemas.openxmlformats.org/officeDocument/2006/relationships" xmlns:m="http://schemas.openxmlformats.org/officeDocument/2006/math" xmlns:v="urn:schemas-microsoft-com:vml" xmlns:wp14="http://schemas.microsoft.com/office/word/2010/wordprocessingDrawing" xmlns:wp="http://schemas.openxmlformats.org/drawingml/2006/wordprocessingDrawing" xmlns:w10="urn:schemas-microsoft-com:office:word" xmlns:w="http://schemas.openxmlformats.org/wordprocessingml/2006/main" xmlns:w14="http://schemas.microsoft.com/office/word/2010/wordml" xmlns:w15="http://schemas.microsoft.com/office/word/2012/wordml" xmlns:w16cex="http://schemas.microsoft.com/office/word/2018/wordml/cex" xmlns:w16cid="http://schemas.microsoft.com/office/word/2016/wordml/cid" xmlns:w16="http://schemas.microsoft.com/office/word/2018/wordml" xmlns:w16du="http://schemas.microsoft.com/office/word/2023/wordml/word16du" xmlns:w16sdtdh="http://schemas.microsoft.com/office/word/2020/wordml/sdtdatahash" xmlns:w16sdtfl="http://schemas.microsoft.com/office/word/2024/wordml/sdtformatlock" xmlns:w16se="http://schemas.microsoft.com/office/word/2015/wordml/symex" xmlns:wpg="http://schemas.microsoft.com/office/word/2010/wordprocessingGroup" xmlns:wpi="http://schemas.microsoft.com/office/word/2010/wordprocessingInk" xmlns:wne="http://schemas.microsoft.com/office/word/2006/wordml" xmlns:wps="http://schemas.microsoft.com/office/word/2010/wordprocessingShape" mc:Ignorable="w14 w15 w16se w16cid w16 w16cex w16sdtdh w16sdtfl w16du wp14">
   <w:p>
     <w:pPr>
       <w:pStyle w:val="Footer"/>
@@ -3537,7 +3610,7 @@
 </file>
 
 <file path=word/footer3.xml><?xml version="1.0" encoding="utf-8"?>
-<w:ftr xmlns:wpc="http://schemas.microsoft.com/office/word/2010/wordprocessingCanvas" xmlns:cx="http://schemas.microsoft.com/office/drawing/2014/chartex" xmlns:cx1="http://schemas.microsoft.com/office/drawing/2015/9/8/chartex" xmlns:cx2="http://schemas.microsoft.com/office/drawing/2015/10/21/chartex" xmlns:cx3="http://schemas.microsoft.com/office/drawing/2016/5/9/chartex" xmlns:cx4="http://schemas.microsoft.com/office/drawing/2016/5/10/chartex" xmlns:cx5="http://schemas.microsoft.com/office/drawing/2016/5/11/chartex" xmlns:cx6="http://schemas.microsoft.com/office/drawing/2016/5/12/chartex" xmlns:cx7="http://schemas.microsoft.com/office/drawing/2016/5/13/chartex" xmlns:cx8="http://schemas.microsoft.com/office/drawing/2016/5/14/chartex" xmlns:mc="http://schemas.openxmlformats.org/markup-compatibility/2006" xmlns:aink="http://schemas.microsoft.com/office/drawing/2016/ink" xmlns:am3d="http://schemas.microsoft.com/office/drawing/2017/model3d" xmlns:o="urn:schemas-microsoft-com:office:office" xmlns:oel="http://schemas.microsoft.com/office/2019/extlst" xmlns:r="http://schemas.openxmlformats.org/officeDocument/2006/relationships" xmlns:m="http://schemas.openxmlformats.org/officeDocument/2006/math" xmlns:v="urn:schemas-microsoft-com:vml" xmlns:wp14="http://schemas.microsoft.com/office/word/2010/wordprocessingDrawing" xmlns:wp="http://schemas.openxmlformats.org/drawingml/2006/wordprocessingDrawing" xmlns:w10="urn:schemas-microsoft-com:office:word" xmlns:w="http://schemas.openxmlformats.org/wordprocessingml/2006/main" xmlns:w14="http://schemas.microsoft.com/office/word/2010/wordml" xmlns:w15="http://schemas.microsoft.com/office/word/2012/wordml" xmlns:w16cex="http://schemas.microsoft.com/office/word/2018/wordml/cex" xmlns:w16cid="http://schemas.microsoft.com/office/word/2016/wordml/cid" xmlns:w16="http://schemas.microsoft.com/office/word/2018/wordml" xmlns:w16sdtdh="http://schemas.microsoft.com/office/word/2020/wordml/sdtdatahash" xmlns:w16se="http://schemas.microsoft.com/office/word/2015/wordml/symex" xmlns:wpg="http://schemas.microsoft.com/office/word/2010/wordprocessingGroup" xmlns:wpi="http://schemas.microsoft.com/office/word/2010/wordprocessingInk" xmlns:wne="http://schemas.microsoft.com/office/word/2006/wordml" xmlns:wps="http://schemas.microsoft.com/office/word/2010/wordprocessingShape" mc:Ignorable="w14 w15 w16se w16cid w16 w16cex w16sdtdh wp14">
+<w:ftr xmlns:wpc="http://schemas.microsoft.com/office/word/2010/wordprocessingCanvas" xmlns:cx="http://schemas.microsoft.com/office/drawing/2014/chartex" xmlns:cx1="http://schemas.microsoft.com/office/drawing/2015/9/8/chartex" xmlns:cx2="http://schemas.microsoft.com/office/drawing/2015/10/21/chartex" xmlns:cx3="http://schemas.microsoft.com/office/drawing/2016/5/9/chartex" xmlns:cx4="http://schemas.microsoft.com/office/drawing/2016/5/10/chartex" xmlns:cx5="http://schemas.microsoft.com/office/drawing/2016/5/11/chartex" xmlns:cx6="http://schemas.microsoft.com/office/drawing/2016/5/12/chartex" xmlns:cx7="http://schemas.microsoft.com/office/drawing/2016/5/13/chartex" xmlns:cx8="http://schemas.microsoft.com/office/drawing/2016/5/14/chartex" xmlns:mc="http://schemas.openxmlformats.org/markup-compatibility/2006" xmlns:aink="http://schemas.microsoft.com/office/drawing/2016/ink" xmlns:am3d="http://schemas.microsoft.com/office/drawing/2017/model3d" xmlns:o="urn:schemas-microsoft-com:office:office" xmlns:oel="http://schemas.microsoft.com/office/2019/extlst" xmlns:r="http://schemas.openxmlformats.org/officeDocument/2006/relationships" xmlns:m="http://schemas.openxmlformats.org/officeDocument/2006/math" xmlns:v="urn:schemas-microsoft-com:vml" xmlns:wp14="http://schemas.microsoft.com/office/word/2010/wordprocessingDrawing" xmlns:wp="http://schemas.openxmlformats.org/drawingml/2006/wordprocessingDrawing" xmlns:w10="urn:schemas-microsoft-com:office:word" xmlns:w="http://schemas.openxmlformats.org/wordprocessingml/2006/main" xmlns:w14="http://schemas.microsoft.com/office/word/2010/wordml" xmlns:w15="http://schemas.microsoft.com/office/word/2012/wordml" xmlns:w16cex="http://schemas.microsoft.com/office/word/2018/wordml/cex" xmlns:w16cid="http://schemas.microsoft.com/office/word/2016/wordml/cid" xmlns:w16="http://schemas.microsoft.com/office/word/2018/wordml" xmlns:w16du="http://schemas.microsoft.com/office/word/2023/wordml/word16du" xmlns:w16sdtdh="http://schemas.microsoft.com/office/word/2020/wordml/sdtdatahash" xmlns:w16sdtfl="http://schemas.microsoft.com/office/word/2024/wordml/sdtformatlock" xmlns:w16se="http://schemas.microsoft.com/office/word/2015/wordml/symex" xmlns:wpg="http://schemas.microsoft.com/office/word/2010/wordprocessingGroup" xmlns:wpi="http://schemas.microsoft.com/office/word/2010/wordprocessingInk" xmlns:wne="http://schemas.microsoft.com/office/word/2006/wordml" xmlns:wps="http://schemas.microsoft.com/office/word/2010/wordprocessingShape" mc:Ignorable="w14 w15 w16se w16cid w16 w16cex w16sdtdh w16sdtfl w16du wp14">
   <w:p>
     <w:pPr>
       <w:pStyle w:val="Footer"/>
@@ -3547,7 +3620,7 @@
 </file>
 
 <file path=word/footer4.xml><?xml version="1.0" encoding="utf-8"?>
-<w:ftr xmlns:wpc="http://schemas.microsoft.com/office/word/2010/wordprocessingCanvas" xmlns:cx="http://schemas.microsoft.com/office/drawing/2014/chartex" xmlns:cx1="http://schemas.microsoft.com/office/drawing/2015/9/8/chartex" xmlns:cx2="http://schemas.microsoft.com/office/drawing/2015/10/21/chartex" xmlns:cx3="http://schemas.microsoft.com/office/drawing/2016/5/9/chartex" xmlns:cx4="http://schemas.microsoft.com/office/drawing/2016/5/10/chartex" xmlns:cx5="http://schemas.microsoft.com/office/drawing/2016/5/11/chartex" xmlns:cx6="http://schemas.microsoft.com/office/drawing/2016/5/12/chartex" xmlns:cx7="http://schemas.microsoft.com/office/drawing/2016/5/13/chartex" xmlns:cx8="http://schemas.microsoft.com/office/drawing/2016/5/14/chartex" xmlns:mc="http://schemas.openxmlformats.org/markup-compatibility/2006" xmlns:aink="http://schemas.microsoft.com/office/drawing/2016/ink" xmlns:am3d="http://schemas.microsoft.com/office/drawing/2017/model3d" xmlns:o="urn:schemas-microsoft-com:office:office" xmlns:oel="http://schemas.microsoft.com/office/2019/extlst" xmlns:r="http://schemas.openxmlformats.org/officeDocument/2006/relationships" xmlns:m="http://schemas.openxmlformats.org/officeDocument/2006/math" xmlns:v="urn:schemas-microsoft-com:vml" xmlns:wp14="http://schemas.microsoft.com/office/word/2010/wordprocessingDrawing" xmlns:wp="http://schemas.openxmlformats.org/drawingml/2006/wordprocessingDrawing" xmlns:w10="urn:schemas-microsoft-com:office:word" xmlns:w="http://schemas.openxmlformats.org/wordprocessingml/2006/main" xmlns:w14="http://schemas.microsoft.com/office/word/2010/wordml" xmlns:w15="http://schemas.microsoft.com/office/word/2012/wordml" xmlns:w16cex="http://schemas.microsoft.com/office/word/2018/wordml/cex" xmlns:w16cid="http://schemas.microsoft.com/office/word/2016/wordml/cid" xmlns:w16="http://schemas.microsoft.com/office/word/2018/wordml" xmlns:w16sdtdh="http://schemas.microsoft.com/office/word/2020/wordml/sdtdatahash" xmlns:w16se="http://schemas.microsoft.com/office/word/2015/wordml/symex" xmlns:wpg="http://schemas.microsoft.com/office/word/2010/wordprocessingGroup" xmlns:wpi="http://schemas.microsoft.com/office/word/2010/wordprocessingInk" xmlns:wne="http://schemas.microsoft.com/office/word/2006/wordml" xmlns:wps="http://schemas.microsoft.com/office/word/2010/wordprocessingShape" mc:Ignorable="w14 w15 w16se w16cid w16 w16cex w16sdtdh wp14">
+<w:ftr xmlns:wpc="http://schemas.microsoft.com/office/word/2010/wordprocessingCanvas" xmlns:cx="http://schemas.microsoft.com/office/drawing/2014/chartex" xmlns:cx1="http://schemas.microsoft.com/office/drawing/2015/9/8/chartex" xmlns:cx2="http://schemas.microsoft.com/office/drawing/2015/10/21/chartex" xmlns:cx3="http://schemas.microsoft.com/office/drawing/2016/5/9/chartex" xmlns:cx4="http://schemas.microsoft.com/office/drawing/2016/5/10/chartex" xmlns:cx5="http://schemas.microsoft.com/office/drawing/2016/5/11/chartex" xmlns:cx6="http://schemas.microsoft.com/office/drawing/2016/5/12/chartex" xmlns:cx7="http://schemas.microsoft.com/office/drawing/2016/5/13/chartex" xmlns:cx8="http://schemas.microsoft.com/office/drawing/2016/5/14/chartex" xmlns:mc="http://schemas.openxmlformats.org/markup-compatibility/2006" xmlns:aink="http://schemas.microsoft.com/office/drawing/2016/ink" xmlns:am3d="http://schemas.microsoft.com/office/drawing/2017/model3d" xmlns:o="urn:schemas-microsoft-com:office:office" xmlns:oel="http://schemas.microsoft.com/office/2019/extlst" xmlns:r="http://schemas.openxmlformats.org/officeDocument/2006/relationships" xmlns:m="http://schemas.openxmlformats.org/officeDocument/2006/math" xmlns:v="urn:schemas-microsoft-com:vml" xmlns:wp14="http://schemas.microsoft.com/office/word/2010/wordprocessingDrawing" xmlns:wp="http://schemas.openxmlformats.org/drawingml/2006/wordprocessingDrawing" xmlns:w10="urn:schemas-microsoft-com:office:word" xmlns:w="http://schemas.openxmlformats.org/wordprocessingml/2006/main" xmlns:w14="http://schemas.microsoft.com/office/word/2010/wordml" xmlns:w15="http://schemas.microsoft.com/office/word/2012/wordml" xmlns:w16cex="http://schemas.microsoft.com/office/word/2018/wordml/cex" xmlns:w16cid="http://schemas.microsoft.com/office/word/2016/wordml/cid" xmlns:w16="http://schemas.microsoft.com/office/word/2018/wordml" xmlns:w16du="http://schemas.microsoft.com/office/word/2023/wordml/word16du" xmlns:w16sdtdh="http://schemas.microsoft.com/office/word/2020/wordml/sdtdatahash" xmlns:w16sdtfl="http://schemas.microsoft.com/office/word/2024/wordml/sdtformatlock" xmlns:w16se="http://schemas.microsoft.com/office/word/2015/wordml/symex" xmlns:wpg="http://schemas.microsoft.com/office/word/2010/wordprocessingGroup" xmlns:wpi="http://schemas.microsoft.com/office/word/2010/wordprocessingInk" xmlns:wne="http://schemas.microsoft.com/office/word/2006/wordml" xmlns:wps="http://schemas.microsoft.com/office/word/2010/wordprocessingShape" mc:Ignorable="w14 w15 w16se w16cid w16 w16cex w16sdtdh w16sdtfl w16du wp14">
   <w:p>
     <w:pPr>
       <w:pStyle w:val="Footer"/>
@@ -3557,7 +3630,7 @@
 </file>
 
 <file path=word/footer5.xml><?xml version="1.0" encoding="utf-8"?>
-<w:ftr xmlns:wpc="http://schemas.microsoft.com/office/word/2010/wordprocessingCanvas" xmlns:cx="http://schemas.microsoft.com/office/drawing/2014/chartex" xmlns:cx1="http://schemas.microsoft.com/office/drawing/2015/9/8/chartex" xmlns:cx2="http://schemas.microsoft.com/office/drawing/2015/10/21/chartex" xmlns:cx3="http://schemas.microsoft.com/office/drawing/2016/5/9/chartex" xmlns:cx4="http://schemas.microsoft.com/office/drawing/2016/5/10/chartex" xmlns:cx5="http://schemas.microsoft.com/office/drawing/2016/5/11/chartex" xmlns:cx6="http://schemas.microsoft.com/office/drawing/2016/5/12/chartex" xmlns:cx7="http://schemas.microsoft.com/office/drawing/2016/5/13/chartex" xmlns:cx8="http://schemas.microsoft.com/office/drawing/2016/5/14/chartex" xmlns:mc="http://schemas.openxmlformats.org/markup-compatibility/2006" xmlns:aink="http://schemas.microsoft.com/office/drawing/2016/ink" xmlns:am3d="http://schemas.microsoft.com/office/drawing/2017/model3d" xmlns:o="urn:schemas-microsoft-com:office:office" xmlns:oel="http://schemas.microsoft.com/office/2019/extlst" xmlns:r="http://schemas.openxmlformats.org/officeDocument/2006/relationships" xmlns:m="http://schemas.openxmlformats.org/officeDocument/2006/math" xmlns:v="urn:schemas-microsoft-com:vml" xmlns:wp14="http://schemas.microsoft.com/office/word/2010/wordprocessingDrawing" xmlns:wp="http://schemas.openxmlformats.org/drawingml/2006/wordprocessingDrawing" xmlns:w10="urn:schemas-microsoft-com:office:word" xmlns:w="http://schemas.openxmlformats.org/wordprocessingml/2006/main" xmlns:w14="http://schemas.microsoft.com/office/word/2010/wordml" xmlns:w15="http://schemas.microsoft.com/office/word/2012/wordml" xmlns:w16cex="http://schemas.microsoft.com/office/word/2018/wordml/cex" xmlns:w16cid="http://schemas.microsoft.com/office/word/2016/wordml/cid" xmlns:w16="http://schemas.microsoft.com/office/word/2018/wordml" xmlns:w16sdtdh="http://schemas.microsoft.com/office/word/2020/wordml/sdtdatahash" xmlns:w16se="http://schemas.microsoft.com/office/word/2015/wordml/symex" xmlns:wpg="http://schemas.microsoft.com/office/word/2010/wordprocessingGroup" xmlns:wpi="http://schemas.microsoft.com/office/word/2010/wordprocessingInk" xmlns:wne="http://schemas.microsoft.com/office/word/2006/wordml" xmlns:wps="http://schemas.microsoft.com/office/word/2010/wordprocessingShape" mc:Ignorable="w14 w15 w16se w16cid w16 w16cex w16sdtdh wp14">
+<w:ftr xmlns:wpc="http://schemas.microsoft.com/office/word/2010/wordprocessingCanvas" xmlns:cx="http://schemas.microsoft.com/office/drawing/2014/chartex" xmlns:cx1="http://schemas.microsoft.com/office/drawing/2015/9/8/chartex" xmlns:cx2="http://schemas.microsoft.com/office/drawing/2015/10/21/chartex" xmlns:cx3="http://schemas.microsoft.com/office/drawing/2016/5/9/chartex" xmlns:cx4="http://schemas.microsoft.com/office/drawing/2016/5/10/chartex" xmlns:cx5="http://schemas.microsoft.com/office/drawing/2016/5/11/chartex" xmlns:cx6="http://schemas.microsoft.com/office/drawing/2016/5/12/chartex" xmlns:cx7="http://schemas.microsoft.com/office/drawing/2016/5/13/chartex" xmlns:cx8="http://schemas.microsoft.com/office/drawing/2016/5/14/chartex" xmlns:mc="http://schemas.openxmlformats.org/markup-compatibility/2006" xmlns:aink="http://schemas.microsoft.com/office/drawing/2016/ink" xmlns:am3d="http://schemas.microsoft.com/office/drawing/2017/model3d" xmlns:o="urn:schemas-microsoft-com:office:office" xmlns:oel="http://schemas.microsoft.com/office/2019/extlst" xmlns:r="http://schemas.openxmlformats.org/officeDocument/2006/relationships" xmlns:m="http://schemas.openxmlformats.org/officeDocument/2006/math" xmlns:v="urn:schemas-microsoft-com:vml" xmlns:wp14="http://schemas.microsoft.com/office/word/2010/wordprocessingDrawing" xmlns:wp="http://schemas.openxmlformats.org/drawingml/2006/wordprocessingDrawing" xmlns:w10="urn:schemas-microsoft-com:office:word" xmlns:w="http://schemas.openxmlformats.org/wordprocessingml/2006/main" xmlns:w14="http://schemas.microsoft.com/office/word/2010/wordml" xmlns:w15="http://schemas.microsoft.com/office/word/2012/wordml" xmlns:w16cex="http://schemas.microsoft.com/office/word/2018/wordml/cex" xmlns:w16cid="http://schemas.microsoft.com/office/word/2016/wordml/cid" xmlns:w16="http://schemas.microsoft.com/office/word/2018/wordml" xmlns:w16du="http://schemas.microsoft.com/office/word/2023/wordml/word16du" xmlns:w16sdtdh="http://schemas.microsoft.com/office/word/2020/wordml/sdtdatahash" xmlns:w16sdtfl="http://schemas.microsoft.com/office/word/2024/wordml/sdtformatlock" xmlns:w16se="http://schemas.microsoft.com/office/word/2015/wordml/symex" xmlns:wpg="http://schemas.microsoft.com/office/word/2010/wordprocessingGroup" xmlns:wpi="http://schemas.microsoft.com/office/word/2010/wordprocessingInk" xmlns:wne="http://schemas.microsoft.com/office/word/2006/wordml" xmlns:wps="http://schemas.microsoft.com/office/word/2010/wordprocessingShape" mc:Ignorable="w14 w15 w16se w16cid w16 w16cex w16sdtdh w16sdtfl w16du wp14">
   <w:p>
     <w:pPr>
       <w:pStyle w:val="Footer"/>
@@ -3567,7 +3640,7 @@
 </file>
 
 <file path=word/footer6.xml><?xml version="1.0" encoding="utf-8"?>
-<w:ftr xmlns:wpc="http://schemas.microsoft.com/office/word/2010/wordprocessingCanvas" xmlns:cx="http://schemas.microsoft.com/office/drawing/2014/chartex" xmlns:cx1="http://schemas.microsoft.com/office/drawing/2015/9/8/chartex" xmlns:cx2="http://schemas.microsoft.com/office/drawing/2015/10/21/chartex" xmlns:cx3="http://schemas.microsoft.com/office/drawing/2016/5/9/chartex" xmlns:cx4="http://schemas.microsoft.com/office/drawing/2016/5/10/chartex" xmlns:cx5="http://schemas.microsoft.com/office/drawing/2016/5/11/chartex" xmlns:cx6="http://schemas.microsoft.com/office/drawing/2016/5/12/chartex" xmlns:cx7="http://schemas.microsoft.com/office/drawing/2016/5/13/chartex" xmlns:cx8="http://schemas.microsoft.com/office/drawing/2016/5/14/chartex" xmlns:mc="http://schemas.openxmlformats.org/markup-compatibility/2006" xmlns:aink="http://schemas.microsoft.com/office/drawing/2016/ink" xmlns:am3d="http://schemas.microsoft.com/office/drawing/2017/model3d" xmlns:o="urn:schemas-microsoft-com:office:office" xmlns:oel="http://schemas.microsoft.com/office/2019/extlst" xmlns:r="http://schemas.openxmlformats.org/officeDocument/2006/relationships" xmlns:m="http://schemas.openxmlformats.org/officeDocument/2006/math" xmlns:v="urn:schemas-microsoft-com:vml" xmlns:wp14="http://schemas.microsoft.com/office/word/2010/wordprocessingDrawing" xmlns:wp="http://schemas.openxmlformats.org/drawingml/2006/wordprocessingDrawing" xmlns:w10="urn:schemas-microsoft-com:office:word" xmlns:w="http://schemas.openxmlformats.org/wordprocessingml/2006/main" xmlns:w14="http://schemas.microsoft.com/office/word/2010/wordml" xmlns:w15="http://schemas.microsoft.com/office/word/2012/wordml" xmlns:w16cex="http://schemas.microsoft.com/office/word/2018/wordml/cex" xmlns:w16cid="http://schemas.microsoft.com/office/word/2016/wordml/cid" xmlns:w16="http://schemas.microsoft.com/office/word/2018/wordml" xmlns:w16sdtdh="http://schemas.microsoft.com/office/word/2020/wordml/sdtdatahash" xmlns:w16se="http://schemas.microsoft.com/office/word/2015/wordml/symex" xmlns:wpg="http://schemas.microsoft.com/office/word/2010/wordprocessingGroup" xmlns:wpi="http://schemas.microsoft.com/office/word/2010/wordprocessingInk" xmlns:wne="http://schemas.microsoft.com/office/word/2006/wordml" xmlns:wps="http://schemas.microsoft.com/office/word/2010/wordprocessingShape" mc:Ignorable="w14 w15 w16se w16cid w16 w16cex w16sdtdh wp14">
+<w:ftr xmlns:wpc="http://schemas.microsoft.com/office/word/2010/wordprocessingCanvas" xmlns:cx="http://schemas.microsoft.com/office/drawing/2014/chartex" xmlns:cx1="http://schemas.microsoft.com/office/drawing/2015/9/8/chartex" xmlns:cx2="http://schemas.microsoft.com/office/drawing/2015/10/21/chartex" xmlns:cx3="http://schemas.microsoft.com/office/drawing/2016/5/9/chartex" xmlns:cx4="http://schemas.microsoft.com/office/drawing/2016/5/10/chartex" xmlns:cx5="http://schemas.microsoft.com/office/drawing/2016/5/11/chartex" xmlns:cx6="http://schemas.microsoft.com/office/drawing/2016/5/12/chartex" xmlns:cx7="http://schemas.microsoft.com/office/drawing/2016/5/13/chartex" xmlns:cx8="http://schemas.microsoft.com/office/drawing/2016/5/14/chartex" xmlns:mc="http://schemas.openxmlformats.org/markup-compatibility/2006" xmlns:aink="http://schemas.microsoft.com/office/drawing/2016/ink" xmlns:am3d="http://schemas.microsoft.com/office/drawing/2017/model3d" xmlns:o="urn:schemas-microsoft-com:office:office" xmlns:oel="http://schemas.microsoft.com/office/2019/extlst" xmlns:r="http://schemas.openxmlformats.org/officeDocument/2006/relationships" xmlns:m="http://schemas.openxmlformats.org/officeDocument/2006/math" xmlns:v="urn:schemas-microsoft-com:vml" xmlns:wp14="http://schemas.microsoft.com/office/word/2010/wordprocessingDrawing" xmlns:wp="http://schemas.openxmlformats.org/drawingml/2006/wordprocessingDrawing" xmlns:w10="urn:schemas-microsoft-com:office:word" xmlns:w="http://schemas.openxmlformats.org/wordprocessingml/2006/main" xmlns:w14="http://schemas.microsoft.com/office/word/2010/wordml" xmlns:w15="http://schemas.microsoft.com/office/word/2012/wordml" xmlns:w16cex="http://schemas.microsoft.com/office/word/2018/wordml/cex" xmlns:w16cid="http://schemas.microsoft.com/office/word/2016/wordml/cid" xmlns:w16="http://schemas.microsoft.com/office/word/2018/wordml" xmlns:w16du="http://schemas.microsoft.com/office/word/2023/wordml/word16du" xmlns:w16sdtdh="http://schemas.microsoft.com/office/word/2020/wordml/sdtdatahash" xmlns:w16sdtfl="http://schemas.microsoft.com/office/word/2024/wordml/sdtformatlock" xmlns:w16se="http://schemas.microsoft.com/office/word/2015/wordml/symex" xmlns:wpg="http://schemas.microsoft.com/office/word/2010/wordprocessingGroup" xmlns:wpi="http://schemas.microsoft.com/office/word/2010/wordprocessingInk" xmlns:wne="http://schemas.microsoft.com/office/word/2006/wordml" xmlns:wps="http://schemas.microsoft.com/office/word/2010/wordprocessingShape" mc:Ignorable="w14 w15 w16se w16cid w16 w16cex w16sdtdh w16sdtfl w16du wp14">
   <w:p>
     <w:pPr>
       <w:pStyle w:val="Footer"/>
@@ -3577,7 +3650,7 @@
 </file>
 
 <file path=word/footnotes.xml><?xml version="1.0" encoding="utf-8"?>
-<w:footnotes xmlns:wpc="http://schemas.microsoft.com/office/word/2010/wordprocessingCanvas" xmlns:cx="http://schemas.microsoft.com/office/drawing/2014/chartex" xmlns:cx1="http://schemas.microsoft.com/office/drawing/2015/9/8/chartex" xmlns:cx2="http://schemas.microsoft.com/office/drawing/2015/10/21/chartex" xmlns:cx3="http://schemas.microsoft.com/office/drawing/2016/5/9/chartex" xmlns:cx4="http://schemas.microsoft.com/office/drawing/2016/5/10/chartex" xmlns:cx5="http://schemas.microsoft.com/office/drawing/2016/5/11/chartex" xmlns:cx6="http://schemas.microsoft.com/office/drawing/2016/5/12/chartex" xmlns:cx7="http://schemas.microsoft.com/office/drawing/2016/5/13/chartex" xmlns:cx8="http://schemas.microsoft.com/office/drawing/2016/5/14/chartex" xmlns:mc="http://schemas.openxmlformats.org/markup-compatibility/2006" xmlns:aink="http://schemas.microsoft.com/office/drawing/2016/ink" xmlns:am3d="http://schemas.microsoft.com/office/drawing/2017/model3d" xmlns:o="urn:schemas-microsoft-com:office:office" xmlns:oel="http://schemas.microsoft.com/office/2019/extlst" xmlns:r="http://schemas.openxmlformats.org/officeDocument/2006/relationships" xmlns:m="http://schemas.openxmlformats.org/officeDocument/2006/math" xmlns:v="urn:schemas-microsoft-com:vml" xmlns:wp14="http://schemas.microsoft.com/office/word/2010/wordprocessingDrawing" xmlns:wp="http://schemas.openxmlformats.org/drawingml/2006/wordprocessingDrawing" xmlns:w10="urn:schemas-microsoft-com:office:word" xmlns:w="http://schemas.openxmlformats.org/wordprocessingml/2006/main" xmlns:w14="http://schemas.microsoft.com/office/word/2010/wordml" xmlns:w15="http://schemas.microsoft.com/office/word/2012/wordml" xmlns:w16cex="http://schemas.microsoft.com/office/word/2018/wordml/cex" xmlns:w16cid="http://schemas.microsoft.com/office/word/2016/wordml/cid" xmlns:w16="http://schemas.microsoft.com/office/word/2018/wordml" xmlns:w16sdtdh="http://schemas.microsoft.com/office/word/2020/wordml/sdtdatahash" xmlns:w16se="http://schemas.microsoft.com/office/word/2015/wordml/symex" xmlns:wpg="http://schemas.microsoft.com/office/word/2010/wordprocessingGroup" xmlns:wpi="http://schemas.microsoft.com/office/word/2010/wordprocessingInk" xmlns:wne="http://schemas.microsoft.com/office/word/2006/wordml" xmlns:wps="http://schemas.microsoft.com/office/word/2010/wordprocessingShape" mc:Ignorable="w14 w15 w16se w16cid w16 w16cex w16sdtdh wp14">
+<w:footnotes xmlns:wpc="http://schemas.microsoft.com/office/word/2010/wordprocessingCanvas" xmlns:cx="http://schemas.microsoft.com/office/drawing/2014/chartex" xmlns:cx1="http://schemas.microsoft.com/office/drawing/2015/9/8/chartex" xmlns:cx2="http://schemas.microsoft.com/office/drawing/2015/10/21/chartex" xmlns:cx3="http://schemas.microsoft.com/office/drawing/2016/5/9/chartex" xmlns:cx4="http://schemas.microsoft.com/office/drawing/2016/5/10/chartex" xmlns:cx5="http://schemas.microsoft.com/office/drawing/2016/5/11/chartex" xmlns:cx6="http://schemas.microsoft.com/office/drawing/2016/5/12/chartex" xmlns:cx7="http://schemas.microsoft.com/office/drawing/2016/5/13/chartex" xmlns:cx8="http://schemas.microsoft.com/office/drawing/2016/5/14/chartex" xmlns:mc="http://schemas.openxmlformats.org/markup-compatibility/2006" xmlns:aink="http://schemas.microsoft.com/office/drawing/2016/ink" xmlns:am3d="http://schemas.microsoft.com/office/drawing/2017/model3d" xmlns:o="urn:schemas-microsoft-com:office:office" xmlns:oel="http://schemas.microsoft.com/office/2019/extlst" xmlns:r="http://schemas.openxmlformats.org/officeDocument/2006/relationships" xmlns:m="http://schemas.openxmlformats.org/officeDocument/2006/math" xmlns:v="urn:schemas-microsoft-com:vml" xmlns:wp14="http://schemas.microsoft.com/office/word/2010/wordprocessingDrawing" xmlns:wp="http://schemas.openxmlformats.org/drawingml/2006/wordprocessingDrawing" xmlns:w10="urn:schemas-microsoft-com:office:word" xmlns:w="http://schemas.openxmlformats.org/wordprocessingml/2006/main" xmlns:w14="http://schemas.microsoft.com/office/word/2010/wordml" xmlns:w15="http://schemas.microsoft.com/office/word/2012/wordml" xmlns:w16cex="http://schemas.microsoft.com/office/word/2018/wordml/cex" xmlns:w16cid="http://schemas.microsoft.com/office/word/2016/wordml/cid" xmlns:w16="http://schemas.microsoft.com/office/word/2018/wordml" xmlns:w16du="http://schemas.microsoft.com/office/word/2023/wordml/word16du" xmlns:w16sdtdh="http://schemas.microsoft.com/office/word/2020/wordml/sdtdatahash" xmlns:w16sdtfl="http://schemas.microsoft.com/office/word/2024/wordml/sdtformatlock" xmlns:w16se="http://schemas.microsoft.com/office/word/2015/wordml/symex" xmlns:wpg="http://schemas.microsoft.com/office/word/2010/wordprocessingGroup" xmlns:wpi="http://schemas.microsoft.com/office/word/2010/wordprocessingInk" xmlns:wne="http://schemas.microsoft.com/office/word/2006/wordml" xmlns:wps="http://schemas.microsoft.com/office/word/2010/wordprocessingShape" mc:Ignorable="w14 w15 w16se w16cid w16 w16cex w16sdtdh w16sdtfl w16du wp14">
   <w:footnote w:type="separator" w:id="-1">
     <w:p>
       <w:r>
@@ -3596,7 +3669,7 @@
 </file>
 
 <file path=word/header1.xml><?xml version="1.0" encoding="utf-8"?>
-<w:hdr xmlns:wpc="http://schemas.microsoft.com/office/word/2010/wordprocessingCanvas" xmlns:cx="http://schemas.microsoft.com/office/drawing/2014/chartex" xmlns:cx1="http://schemas.microsoft.com/office/drawing/2015/9/8/chartex" xmlns:cx2="http://schemas.microsoft.com/office/drawing/2015/10/21/chartex" xmlns:cx3="http://schemas.microsoft.com/office/drawing/2016/5/9/chartex" xmlns:cx4="http://schemas.microsoft.com/office/drawing/2016/5/10/chartex" xmlns:cx5="http://schemas.microsoft.com/office/drawing/2016/5/11/chartex" xmlns:cx6="http://schemas.microsoft.com/office/drawing/2016/5/12/chartex" xmlns:cx7="http://schemas.microsoft.com/office/drawing/2016/5/13/chartex" xmlns:cx8="http://schemas.microsoft.com/office/drawing/2016/5/14/chartex" xmlns:mc="http://schemas.openxmlformats.org/markup-compatibility/2006" xmlns:aink="http://schemas.microsoft.com/office/drawing/2016/ink" xmlns:am3d="http://schemas.microsoft.com/office/drawing/2017/model3d" xmlns:o="urn:schemas-microsoft-com:office:office" xmlns:oel="http://schemas.microsoft.com/office/2019/extlst" xmlns:r="http://schemas.openxmlformats.org/officeDocument/2006/relationships" xmlns:m="http://schemas.openxmlformats.org/officeDocument/2006/math" xmlns:v="urn:schemas-microsoft-com:vml" xmlns:wp14="http://schemas.microsoft.com/office/word/2010/wordprocessingDrawing" xmlns:wp="http://schemas.openxmlformats.org/drawingml/2006/wordprocessingDrawing" xmlns:w10="urn:schemas-microsoft-com:office:word" xmlns:w="http://schemas.openxmlformats.org/wordprocessingml/2006/main" xmlns:w14="http://schemas.microsoft.com/office/word/2010/wordml" xmlns:w15="http://schemas.microsoft.com/office/word/2012/wordml" xmlns:w16cex="http://schemas.microsoft.com/office/word/2018/wordml/cex" xmlns:w16cid="http://schemas.microsoft.com/office/word/2016/wordml/cid" xmlns:w16="http://schemas.microsoft.com/office/word/2018/wordml" xmlns:w16sdtdh="http://schemas.microsoft.com/office/word/2020/wordml/sdtdatahash" xmlns:w16se="http://schemas.microsoft.com/office/word/2015/wordml/symex" xmlns:wpg="http://schemas.microsoft.com/office/word/2010/wordprocessingGroup" xmlns:wpi="http://schemas.microsoft.com/office/word/2010/wordprocessingInk" xmlns:wne="http://schemas.microsoft.com/office/word/2006/wordml" xmlns:wps="http://schemas.microsoft.com/office/word/2010/wordprocessingShape" mc:Ignorable="w14 w15 w16se w16cid w16 w16cex w16sdtdh wp14">
+<w:hdr xmlns:wpc="http://schemas.microsoft.com/office/word/2010/wordprocessingCanvas" xmlns:cx="http://schemas.microsoft.com/office/drawing/2014/chartex" xmlns:cx1="http://schemas.microsoft.com/office/drawing/2015/9/8/chartex" xmlns:cx2="http://schemas.microsoft.com/office/drawing/2015/10/21/chartex" xmlns:cx3="http://schemas.microsoft.com/office/drawing/2016/5/9/chartex" xmlns:cx4="http://schemas.microsoft.com/office/drawing/2016/5/10/chartex" xmlns:cx5="http://schemas.microsoft.com/office/drawing/2016/5/11/chartex" xmlns:cx6="http://schemas.microsoft.com/office/drawing/2016/5/12/chartex" xmlns:cx7="http://schemas.microsoft.com/office/drawing/2016/5/13/chartex" xmlns:cx8="http://schemas.microsoft.com/office/drawing/2016/5/14/chartex" xmlns:mc="http://schemas.openxmlformats.org/markup-compatibility/2006" xmlns:aink="http://schemas.microsoft.com/office/drawing/2016/ink" xmlns:am3d="http://schemas.microsoft.com/office/drawing/2017/model3d" xmlns:o="urn:schemas-microsoft-com:office:office" xmlns:oel="http://schemas.microsoft.com/office/2019/extlst" xmlns:r="http://schemas.openxmlformats.org/officeDocument/2006/relationships" xmlns:m="http://schemas.openxmlformats.org/officeDocument/2006/math" xmlns:v="urn:schemas-microsoft-com:vml" xmlns:wp14="http://schemas.microsoft.com/office/word/2010/wordprocessingDrawing" xmlns:wp="http://schemas.openxmlformats.org/drawingml/2006/wordprocessingDrawing" xmlns:w10="urn:schemas-microsoft-com:office:word" xmlns:w="http://schemas.openxmlformats.org/wordprocessingml/2006/main" xmlns:w14="http://schemas.microsoft.com/office/word/2010/wordml" xmlns:w15="http://schemas.microsoft.com/office/word/2012/wordml" xmlns:w16cex="http://schemas.microsoft.com/office/word/2018/wordml/cex" xmlns:w16cid="http://schemas.microsoft.com/office/word/2016/wordml/cid" xmlns:w16="http://schemas.microsoft.com/office/word/2018/wordml" xmlns:w16du="http://schemas.microsoft.com/office/word/2023/wordml/word16du" xmlns:w16sdtdh="http://schemas.microsoft.com/office/word/2020/wordml/sdtdatahash" xmlns:w16sdtfl="http://schemas.microsoft.com/office/word/2024/wordml/sdtformatlock" xmlns:w16se="http://schemas.microsoft.com/office/word/2015/wordml/symex" xmlns:wpg="http://schemas.microsoft.com/office/word/2010/wordprocessingGroup" xmlns:wpi="http://schemas.microsoft.com/office/word/2010/wordprocessingInk" xmlns:wne="http://schemas.microsoft.com/office/word/2006/wordml" xmlns:wps="http://schemas.microsoft.com/office/word/2010/wordprocessingShape" mc:Ignorable="w14 w15 w16se w16cid w16 w16cex w16sdtdh w16sdtfl w16du wp14">
   <w:p>
     <w:pPr>
       <w:pStyle w:val="Header"/>
@@ -3606,7 +3679,7 @@
 </file>
 
 <file path=word/header2.xml><?xml version="1.0" encoding="utf-8"?>
-<w:hdr xmlns:wpc="http://schemas.microsoft.com/office/word/2010/wordprocessingCanvas" xmlns:cx="http://schemas.microsoft.com/office/drawing/2014/chartex" xmlns:cx1="http://schemas.microsoft.com/office/drawing/2015/9/8/chartex" xmlns:cx2="http://schemas.microsoft.com/office/drawing/2015/10/21/chartex" xmlns:cx3="http://schemas.microsoft.com/office/drawing/2016/5/9/chartex" xmlns:cx4="http://schemas.microsoft.com/office/drawing/2016/5/10/chartex" xmlns:cx5="http://schemas.microsoft.com/office/drawing/2016/5/11/chartex" xmlns:cx6="http://schemas.microsoft.com/office/drawing/2016/5/12/chartex" xmlns:cx7="http://schemas.microsoft.com/office/drawing/2016/5/13/chartex" xmlns:cx8="http://schemas.microsoft.com/office/drawing/2016/5/14/chartex" xmlns:mc="http://schemas.openxmlformats.org/markup-compatibility/2006" xmlns:aink="http://schemas.microsoft.com/office/drawing/2016/ink" xmlns:am3d="http://schemas.microsoft.com/office/drawing/2017/model3d" xmlns:o="urn:schemas-microsoft-com:office:office" xmlns:oel="http://schemas.microsoft.com/office/2019/extlst" xmlns:r="http://schemas.openxmlformats.org/officeDocument/2006/relationships" xmlns:m="http://schemas.openxmlformats.org/officeDocument/2006/math" xmlns:v="urn:schemas-microsoft-com:vml" xmlns:wp14="http://schemas.microsoft.com/office/word/2010/wordprocessingDrawing" xmlns:wp="http://schemas.openxmlformats.org/drawingml/2006/wordprocessingDrawing" xmlns:w10="urn:schemas-microsoft-com:office:word" xmlns:w="http://schemas.openxmlformats.org/wordprocessingml/2006/main" xmlns:w14="http://schemas.microsoft.com/office/word/2010/wordml" xmlns:w15="http://schemas.microsoft.com/office/word/2012/wordml" xmlns:w16cex="http://schemas.microsoft.com/office/word/2018/wordml/cex" xmlns:w16cid="http://schemas.microsoft.com/office/word/2016/wordml/cid" xmlns:w16="http://schemas.microsoft.com/office/word/2018/wordml" xmlns:w16sdtdh="http://schemas.microsoft.com/office/word/2020/wordml/sdtdatahash" xmlns:w16se="http://schemas.microsoft.com/office/word/2015/wordml/symex" xmlns:wpg="http://schemas.microsoft.com/office/word/2010/wordprocessingGroup" xmlns:wpi="http://schemas.microsoft.com/office/word/2010/wordprocessingInk" xmlns:wne="http://schemas.microsoft.com/office/word/2006/wordml" xmlns:wps="http://schemas.microsoft.com/office/word/2010/wordprocessingShape" mc:Ignorable="w14 w15 w16se w16cid w16 w16cex w16sdtdh wp14">
+<w:hdr xmlns:wpc="http://schemas.microsoft.com/office/word/2010/wordprocessingCanvas" xmlns:cx="http://schemas.microsoft.com/office/drawing/2014/chartex" xmlns:cx1="http://schemas.microsoft.com/office/drawing/2015/9/8/chartex" xmlns:cx2="http://schemas.microsoft.com/office/drawing/2015/10/21/chartex" xmlns:cx3="http://schemas.microsoft.com/office/drawing/2016/5/9/chartex" xmlns:cx4="http://schemas.microsoft.com/office/drawing/2016/5/10/chartex" xmlns:cx5="http://schemas.microsoft.com/office/drawing/2016/5/11/chartex" xmlns:cx6="http://schemas.microsoft.com/office/drawing/2016/5/12/chartex" xmlns:cx7="http://schemas.microsoft.com/office/drawing/2016/5/13/chartex" xmlns:cx8="http://schemas.microsoft.com/office/drawing/2016/5/14/chartex" xmlns:mc="http://schemas.openxmlformats.org/markup-compatibility/2006" xmlns:aink="http://schemas.microsoft.com/office/drawing/2016/ink" xmlns:am3d="http://schemas.microsoft.com/office/drawing/2017/model3d" xmlns:o="urn:schemas-microsoft-com:office:office" xmlns:oel="http://schemas.microsoft.com/office/2019/extlst" xmlns:r="http://schemas.openxmlformats.org/officeDocument/2006/relationships" xmlns:m="http://schemas.openxmlformats.org/officeDocument/2006/math" xmlns:v="urn:schemas-microsoft-com:vml" xmlns:wp14="http://schemas.microsoft.com/office/word/2010/wordprocessingDrawing" xmlns:wp="http://schemas.openxmlformats.org/drawingml/2006/wordprocessingDrawing" xmlns:w10="urn:schemas-microsoft-com:office:word" xmlns:w="http://schemas.openxmlformats.org/wordprocessingml/2006/main" xmlns:w14="http://schemas.microsoft.com/office/word/2010/wordml" xmlns:w15="http://schemas.microsoft.com/office/word/2012/wordml" xmlns:w16cex="http://schemas.microsoft.com/office/word/2018/wordml/cex" xmlns:w16cid="http://schemas.microsoft.com/office/word/2016/wordml/cid" xmlns:w16="http://schemas.microsoft.com/office/word/2018/wordml" xmlns:w16du="http://schemas.microsoft.com/office/word/2023/wordml/word16du" xmlns:w16sdtdh="http://schemas.microsoft.com/office/word/2020/wordml/sdtdatahash" xmlns:w16sdtfl="http://schemas.microsoft.com/office/word/2024/wordml/sdtformatlock" xmlns:w16se="http://schemas.microsoft.com/office/word/2015/wordml/symex" xmlns:wpg="http://schemas.microsoft.com/office/word/2010/wordprocessingGroup" xmlns:wpi="http://schemas.microsoft.com/office/word/2010/wordprocessingInk" xmlns:wne="http://schemas.microsoft.com/office/word/2006/wordml" xmlns:wps="http://schemas.microsoft.com/office/word/2010/wordprocessingShape" mc:Ignorable="w14 w15 w16se w16cid w16 w16cex w16sdtdh w16sdtfl w16du wp14">
   <w:p>
     <w:pPr>
       <w:pStyle w:val="Header"/>
@@ -3616,7 +3689,7 @@
 </file>
 
 <file path=word/header3.xml><?xml version="1.0" encoding="utf-8"?>
-<w:hdr xmlns:wpc="http://schemas.microsoft.com/office/word/2010/wordprocessingCanvas" xmlns:cx="http://schemas.microsoft.com/office/drawing/2014/chartex" xmlns:cx1="http://schemas.microsoft.com/office/drawing/2015/9/8/chartex" xmlns:cx2="http://schemas.microsoft.com/office/drawing/2015/10/21/chartex" xmlns:cx3="http://schemas.microsoft.com/office/drawing/2016/5/9/chartex" xmlns:cx4="http://schemas.microsoft.com/office/drawing/2016/5/10/chartex" xmlns:cx5="http://schemas.microsoft.com/office/drawing/2016/5/11/chartex" xmlns:cx6="http://schemas.microsoft.com/office/drawing/2016/5/12/chartex" xmlns:cx7="http://schemas.microsoft.com/office/drawing/2016/5/13/chartex" xmlns:cx8="http://schemas.microsoft.com/office/drawing/2016/5/14/chartex" xmlns:mc="http://schemas.openxmlformats.org/markup-compatibility/2006" xmlns:aink="http://schemas.microsoft.com/office/drawing/2016/ink" xmlns:am3d="http://schemas.microsoft.com/office/drawing/2017/model3d" xmlns:o="urn:schemas-microsoft-com:office:office" xmlns:oel="http://schemas.microsoft.com/office/2019/extlst" xmlns:r="http://schemas.openxmlformats.org/officeDocument/2006/relationships" xmlns:m="http://schemas.openxmlformats.org/officeDocument/2006/math" xmlns:v="urn:schemas-microsoft-com:vml" xmlns:wp14="http://schemas.microsoft.com/office/word/2010/wordprocessingDrawing" xmlns:wp="http://schemas.openxmlformats.org/drawingml/2006/wordprocessingDrawing" xmlns:w10="urn:schemas-microsoft-com:office:word" xmlns:w="http://schemas.openxmlformats.org/wordprocessingml/2006/main" xmlns:w14="http://schemas.microsoft.com/office/word/2010/wordml" xmlns:w15="http://schemas.microsoft.com/office/word/2012/wordml" xmlns:w16cex="http://schemas.microsoft.com/office/word/2018/wordml/cex" xmlns:w16cid="http://schemas.microsoft.com/office/word/2016/wordml/cid" xmlns:w16="http://schemas.microsoft.com/office/word/2018/wordml" xmlns:w16sdtdh="http://schemas.microsoft.com/office/word/2020/wordml/sdtdatahash" xmlns:w16se="http://schemas.microsoft.com/office/word/2015/wordml/symex" xmlns:wpg="http://schemas.microsoft.com/office/word/2010/wordprocessingGroup" xmlns:wpi="http://schemas.microsoft.com/office/word/2010/wordprocessingInk" xmlns:wne="http://schemas.microsoft.com/office/word/2006/wordml" xmlns:wps="http://schemas.microsoft.com/office/word/2010/wordprocessingShape" mc:Ignorable="w14 w15 w16se w16cid w16 w16cex w16sdtdh wp14">
+<w:hdr xmlns:wpc="http://schemas.microsoft.com/office/word/2010/wordprocessingCanvas" xmlns:cx="http://schemas.microsoft.com/office/drawing/2014/chartex" xmlns:cx1="http://schemas.microsoft.com/office/drawing/2015/9/8/chartex" xmlns:cx2="http://schemas.microsoft.com/office/drawing/2015/10/21/chartex" xmlns:cx3="http://schemas.microsoft.com/office/drawing/2016/5/9/chartex" xmlns:cx4="http://schemas.microsoft.com/office/drawing/2016/5/10/chartex" xmlns:cx5="http://schemas.microsoft.com/office/drawing/2016/5/11/chartex" xmlns:cx6="http://schemas.microsoft.com/office/drawing/2016/5/12/chartex" xmlns:cx7="http://schemas.microsoft.com/office/drawing/2016/5/13/chartex" xmlns:cx8="http://schemas.microsoft.com/office/drawing/2016/5/14/chartex" xmlns:mc="http://schemas.openxmlformats.org/markup-compatibility/2006" xmlns:aink="http://schemas.microsoft.com/office/drawing/2016/ink" xmlns:am3d="http://schemas.microsoft.com/office/drawing/2017/model3d" xmlns:o="urn:schemas-microsoft-com:office:office" xmlns:oel="http://schemas.microsoft.com/office/2019/extlst" xmlns:r="http://schemas.openxmlformats.org/officeDocument/2006/relationships" xmlns:m="http://schemas.openxmlformats.org/officeDocument/2006/math" xmlns:v="urn:schemas-microsoft-com:vml" xmlns:wp14="http://schemas.microsoft.com/office/word/2010/wordprocessingDrawing" xmlns:wp="http://schemas.openxmlformats.org/drawingml/2006/wordprocessingDrawing" xmlns:w10="urn:schemas-microsoft-com:office:word" xmlns:w="http://schemas.openxmlformats.org/wordprocessingml/2006/main" xmlns:w14="http://schemas.microsoft.com/office/word/2010/wordml" xmlns:w15="http://schemas.microsoft.com/office/word/2012/wordml" xmlns:w16cex="http://schemas.microsoft.com/office/word/2018/wordml/cex" xmlns:w16cid="http://schemas.microsoft.com/office/word/2016/wordml/cid" xmlns:w16="http://schemas.microsoft.com/office/word/2018/wordml" xmlns:w16du="http://schemas.microsoft.com/office/word/2023/wordml/word16du" xmlns:w16sdtdh="http://schemas.microsoft.com/office/word/2020/wordml/sdtdatahash" xmlns:w16sdtfl="http://schemas.microsoft.com/office/word/2024/wordml/sdtformatlock" xmlns:w16se="http://schemas.microsoft.com/office/word/2015/wordml/symex" xmlns:wpg="http://schemas.microsoft.com/office/word/2010/wordprocessingGroup" xmlns:wpi="http://schemas.microsoft.com/office/word/2010/wordprocessingInk" xmlns:wne="http://schemas.microsoft.com/office/word/2006/wordml" xmlns:wps="http://schemas.microsoft.com/office/word/2010/wordprocessingShape" mc:Ignorable="w14 w15 w16se w16cid w16 w16cex w16sdtdh w16sdtfl w16du wp14">
   <w:p>
     <w:pPr>
       <w:pStyle w:val="Header"/>
@@ -3626,7 +3699,7 @@
 </file>
 
 <file path=word/header4.xml><?xml version="1.0" encoding="utf-8"?>
-<w:hdr xmlns:wpc="http://schemas.microsoft.com/office/word/2010/wordprocessingCanvas" xmlns:cx="http://schemas.microsoft.com/office/drawing/2014/chartex" xmlns:cx1="http://schemas.microsoft.com/office/drawing/2015/9/8/chartex" xmlns:cx2="http://schemas.microsoft.com/office/drawing/2015/10/21/chartex" xmlns:cx3="http://schemas.microsoft.com/office/drawing/2016/5/9/chartex" xmlns:cx4="http://schemas.microsoft.com/office/drawing/2016/5/10/chartex" xmlns:cx5="http://schemas.microsoft.com/office/drawing/2016/5/11/chartex" xmlns:cx6="http://schemas.microsoft.com/office/drawing/2016/5/12/chartex" xmlns:cx7="http://schemas.microsoft.com/office/drawing/2016/5/13/chartex" xmlns:cx8="http://schemas.microsoft.com/office/drawing/2016/5/14/chartex" xmlns:mc="http://schemas.openxmlformats.org/markup-compatibility/2006" xmlns:aink="http://schemas.microsoft.com/office/drawing/2016/ink" xmlns:am3d="http://schemas.microsoft.com/office/drawing/2017/model3d" xmlns:o="urn:schemas-microsoft-com:office:office" xmlns:oel="http://schemas.microsoft.com/office/2019/extlst" xmlns:r="http://schemas.openxmlformats.org/officeDocument/2006/relationships" xmlns:m="http://schemas.openxmlformats.org/officeDocument/2006/math" xmlns:v="urn:schemas-microsoft-com:vml" xmlns:wp14="http://schemas.microsoft.com/office/word/2010/wordprocessingDrawing" xmlns:wp="http://schemas.openxmlformats.org/drawingml/2006/wordprocessingDrawing" xmlns:w10="urn:schemas-microsoft-com:office:word" xmlns:w="http://schemas.openxmlformats.org/wordprocessingml/2006/main" xmlns:w14="http://schemas.microsoft.com/office/word/2010/wordml" xmlns:w15="http://schemas.microsoft.com/office/word/2012/wordml" xmlns:w16cex="http://schemas.microsoft.com/office/word/2018/wordml/cex" xmlns:w16cid="http://schemas.microsoft.com/office/word/2016/wordml/cid" xmlns:w16="http://schemas.microsoft.com/office/word/2018/wordml" xmlns:w16sdtdh="http://schemas.microsoft.com/office/word/2020/wordml/sdtdatahash" xmlns:w16se="http://schemas.microsoft.com/office/word/2015/wordml/symex" xmlns:wpg="http://schemas.microsoft.com/office/word/2010/wordprocessingGroup" xmlns:wpi="http://schemas.microsoft.com/office/word/2010/wordprocessingInk" xmlns:wne="http://schemas.microsoft.com/office/word/2006/wordml" xmlns:wps="http://schemas.microsoft.com/office/word/2010/wordprocessingShape" mc:Ignorable="w14 w15 w16se w16cid w16 w16cex w16sdtdh wp14">
+<w:hdr xmlns:wpc="http://schemas.microsoft.com/office/word/2010/wordprocessingCanvas" xmlns:cx="http://schemas.microsoft.com/office/drawing/2014/chartex" xmlns:cx1="http://schemas.microsoft.com/office/drawing/2015/9/8/chartex" xmlns:cx2="http://schemas.microsoft.com/office/drawing/2015/10/21/chartex" xmlns:cx3="http://schemas.microsoft.com/office/drawing/2016/5/9/chartex" xmlns:cx4="http://schemas.microsoft.com/office/drawing/2016/5/10/chartex" xmlns:cx5="http://schemas.microsoft.com/office/drawing/2016/5/11/chartex" xmlns:cx6="http://schemas.microsoft.com/office/drawing/2016/5/12/chartex" xmlns:cx7="http://schemas.microsoft.com/office/drawing/2016/5/13/chartex" xmlns:cx8="http://schemas.microsoft.com/office/drawing/2016/5/14/chartex" xmlns:mc="http://schemas.openxmlformats.org/markup-compatibility/2006" xmlns:aink="http://schemas.microsoft.com/office/drawing/2016/ink" xmlns:am3d="http://schemas.microsoft.com/office/drawing/2017/model3d" xmlns:o="urn:schemas-microsoft-com:office:office" xmlns:oel="http://schemas.microsoft.com/office/2019/extlst" xmlns:r="http://schemas.openxmlformats.org/officeDocument/2006/relationships" xmlns:m="http://schemas.openxmlformats.org/officeDocument/2006/math" xmlns:v="urn:schemas-microsoft-com:vml" xmlns:wp14="http://schemas.microsoft.com/office/word/2010/wordprocessingDrawing" xmlns:wp="http://schemas.openxmlformats.org/drawingml/2006/wordprocessingDrawing" xmlns:w10="urn:schemas-microsoft-com:office:word" xmlns:w="http://schemas.openxmlformats.org/wordprocessingml/2006/main" xmlns:w14="http://schemas.microsoft.com/office/word/2010/wordml" xmlns:w15="http://schemas.microsoft.com/office/word/2012/wordml" xmlns:w16cex="http://schemas.microsoft.com/office/word/2018/wordml/cex" xmlns:w16cid="http://schemas.microsoft.com/office/word/2016/wordml/cid" xmlns:w16="http://schemas.microsoft.com/office/word/2018/wordml" xmlns:w16du="http://schemas.microsoft.com/office/word/2023/wordml/word16du" xmlns:w16sdtdh="http://schemas.microsoft.com/office/word/2020/wordml/sdtdatahash" xmlns:w16sdtfl="http://schemas.microsoft.com/office/word/2024/wordml/sdtformatlock" xmlns:w16se="http://schemas.microsoft.com/office/word/2015/wordml/symex" xmlns:wpg="http://schemas.microsoft.com/office/word/2010/wordprocessingGroup" xmlns:wpi="http://schemas.microsoft.com/office/word/2010/wordprocessingInk" xmlns:wne="http://schemas.microsoft.com/office/word/2006/wordml" xmlns:wps="http://schemas.microsoft.com/office/word/2010/wordprocessingShape" mc:Ignorable="w14 w15 w16se w16cid w16 w16cex w16sdtdh w16sdtfl w16du wp14">
   <w:p>
     <w:pPr>
       <w:pStyle w:val="Header"/>
@@ -3636,7 +3709,7 @@
 </file>
 
 <file path=word/header5.xml><?xml version="1.0" encoding="utf-8"?>
-<w:hdr xmlns:wpc="http://schemas.microsoft.com/office/word/2010/wordprocessingCanvas" xmlns:cx="http://schemas.microsoft.com/office/drawing/2014/chartex" xmlns:cx1="http://schemas.microsoft.com/office/drawing/2015/9/8/chartex" xmlns:cx2="http://schemas.microsoft.com/office/drawing/2015/10/21/chartex" xmlns:cx3="http://schemas.microsoft.com/office/drawing/2016/5/9/chartex" xmlns:cx4="http://schemas.microsoft.com/office/drawing/2016/5/10/chartex" xmlns:cx5="http://schemas.microsoft.com/office/drawing/2016/5/11/chartex" xmlns:cx6="http://schemas.microsoft.com/office/drawing/2016/5/12/chartex" xmlns:cx7="http://schemas.microsoft.com/office/drawing/2016/5/13/chartex" xmlns:cx8="http://schemas.microsoft.com/office/drawing/2016/5/14/chartex" xmlns:mc="http://schemas.openxmlformats.org/markup-compatibility/2006" xmlns:aink="http://schemas.microsoft.com/office/drawing/2016/ink" xmlns:am3d="http://schemas.microsoft.com/office/drawing/2017/model3d" xmlns:o="urn:schemas-microsoft-com:office:office" xmlns:oel="http://schemas.microsoft.com/office/2019/extlst" xmlns:r="http://schemas.openxmlformats.org/officeDocument/2006/relationships" xmlns:m="http://schemas.openxmlformats.org/officeDocument/2006/math" xmlns:v="urn:schemas-microsoft-com:vml" xmlns:wp14="http://schemas.microsoft.com/office/word/2010/wordprocessingDrawing" xmlns:wp="http://schemas.openxmlformats.org/drawingml/2006/wordprocessingDrawing" xmlns:w10="urn:schemas-microsoft-com:office:word" xmlns:w="http://schemas.openxmlformats.org/wordprocessingml/2006/main" xmlns:w14="http://schemas.microsoft.com/office/word/2010/wordml" xmlns:w15="http://schemas.microsoft.com/office/word/2012/wordml" xmlns:w16cex="http://schemas.microsoft.com/office/word/2018/wordml/cex" xmlns:w16cid="http://schemas.microsoft.com/office/word/2016/wordml/cid" xmlns:w16="http://schemas.microsoft.com/office/word/2018/wordml" xmlns:w16sdtdh="http://schemas.microsoft.com/office/word/2020/wordml/sdtdatahash" xmlns:w16se="http://schemas.microsoft.com/office/word/2015/wordml/symex" xmlns:wpg="http://schemas.microsoft.com/office/word/2010/wordprocessingGroup" xmlns:wpi="http://schemas.microsoft.com/office/word/2010/wordprocessingInk" xmlns:wne="http://schemas.microsoft.com/office/word/2006/wordml" xmlns:wps="http://schemas.microsoft.com/office/word/2010/wordprocessingShape" mc:Ignorable="w14 w15 w16se w16cid w16 w16cex w16sdtdh wp14">
+<w:hdr xmlns:wpc="http://schemas.microsoft.com/office/word/2010/wordprocessingCanvas" xmlns:cx="http://schemas.microsoft.com/office/drawing/2014/chartex" xmlns:cx1="http://schemas.microsoft.com/office/drawing/2015/9/8/chartex" xmlns:cx2="http://schemas.microsoft.com/office/drawing/2015/10/21/chartex" xmlns:cx3="http://schemas.microsoft.com/office/drawing/2016/5/9/chartex" xmlns:cx4="http://schemas.microsoft.com/office/drawing/2016/5/10/chartex" xmlns:cx5="http://schemas.microsoft.com/office/drawing/2016/5/11/chartex" xmlns:cx6="http://schemas.microsoft.com/office/drawing/2016/5/12/chartex" xmlns:cx7="http://schemas.microsoft.com/office/drawing/2016/5/13/chartex" xmlns:cx8="http://schemas.microsoft.com/office/drawing/2016/5/14/chartex" xmlns:mc="http://schemas.openxmlformats.org/markup-compatibility/2006" xmlns:aink="http://schemas.microsoft.com/office/drawing/2016/ink" xmlns:am3d="http://schemas.microsoft.com/office/drawing/2017/model3d" xmlns:o="urn:schemas-microsoft-com:office:office" xmlns:oel="http://schemas.microsoft.com/office/2019/extlst" xmlns:r="http://schemas.openxmlformats.org/officeDocument/2006/relationships" xmlns:m="http://schemas.openxmlformats.org/officeDocument/2006/math" xmlns:v="urn:schemas-microsoft-com:vml" xmlns:wp14="http://schemas.microsoft.com/office/word/2010/wordprocessingDrawing" xmlns:wp="http://schemas.openxmlformats.org/drawingml/2006/wordprocessingDrawing" xmlns:w10="urn:schemas-microsoft-com:office:word" xmlns:w="http://schemas.openxmlformats.org/wordprocessingml/2006/main" xmlns:w14="http://schemas.microsoft.com/office/word/2010/wordml" xmlns:w15="http://schemas.microsoft.com/office/word/2012/wordml" xmlns:w16cex="http://schemas.microsoft.com/office/word/2018/wordml/cex" xmlns:w16cid="http://schemas.microsoft.com/office/word/2016/wordml/cid" xmlns:w16="http://schemas.microsoft.com/office/word/2018/wordml" xmlns:w16du="http://schemas.microsoft.com/office/word/2023/wordml/word16du" xmlns:w16sdtdh="http://schemas.microsoft.com/office/word/2020/wordml/sdtdatahash" xmlns:w16sdtfl="http://schemas.microsoft.com/office/word/2024/wordml/sdtformatlock" xmlns:w16se="http://schemas.microsoft.com/office/word/2015/wordml/symex" xmlns:wpg="http://schemas.microsoft.com/office/word/2010/wordprocessingGroup" xmlns:wpi="http://schemas.microsoft.com/office/word/2010/wordprocessingInk" xmlns:wne="http://schemas.microsoft.com/office/word/2006/wordml" xmlns:wps="http://schemas.microsoft.com/office/word/2010/wordprocessingShape" mc:Ignorable="w14 w15 w16se w16cid w16 w16cex w16sdtdh w16sdtfl w16du wp14">
   <w:p>
     <w:pPr>
       <w:pStyle w:val="Header"/>
@@ -3646,7 +3719,7 @@
 </file>
 
 <file path=word/header6.xml><?xml version="1.0" encoding="utf-8"?>
-<w:hdr xmlns:wpc="http://schemas.microsoft.com/office/word/2010/wordprocessingCanvas" xmlns:cx="http://schemas.microsoft.com/office/drawing/2014/chartex" xmlns:cx1="http://schemas.microsoft.com/office/drawing/2015/9/8/chartex" xmlns:cx2="http://schemas.microsoft.com/office/drawing/2015/10/21/chartex" xmlns:cx3="http://schemas.microsoft.com/office/drawing/2016/5/9/chartex" xmlns:cx4="http://schemas.microsoft.com/office/drawing/2016/5/10/chartex" xmlns:cx5="http://schemas.microsoft.com/office/drawing/2016/5/11/chartex" xmlns:cx6="http://schemas.microsoft.com/office/drawing/2016/5/12/chartex" xmlns:cx7="http://schemas.microsoft.com/office/drawing/2016/5/13/chartex" xmlns:cx8="http://schemas.microsoft.com/office/drawing/2016/5/14/chartex" xmlns:mc="http://schemas.openxmlformats.org/markup-compatibility/2006" xmlns:aink="http://schemas.microsoft.com/office/drawing/2016/ink" xmlns:am3d="http://schemas.microsoft.com/office/drawing/2017/model3d" xmlns:o="urn:schemas-microsoft-com:office:office" xmlns:oel="http://schemas.microsoft.com/office/2019/extlst" xmlns:r="http://schemas.openxmlformats.org/officeDocument/2006/relationships" xmlns:m="http://schemas.openxmlformats.org/officeDocument/2006/math" xmlns:v="urn:schemas-microsoft-com:vml" xmlns:wp14="http://schemas.microsoft.com/office/word/2010/wordprocessingDrawing" xmlns:wp="http://schemas.openxmlformats.org/drawingml/2006/wordprocessingDrawing" xmlns:w10="urn:schemas-microsoft-com:office:word" xmlns:w="http://schemas.openxmlformats.org/wordprocessingml/2006/main" xmlns:w14="http://schemas.microsoft.com/office/word/2010/wordml" xmlns:w15="http://schemas.microsoft.com/office/word/2012/wordml" xmlns:w16cex="http://schemas.microsoft.com/office/word/2018/wordml/cex" xmlns:w16cid="http://schemas.microsoft.com/office/word/2016/wordml/cid" xmlns:w16="http://schemas.microsoft.com/office/word/2018/wordml" xmlns:w16sdtdh="http://schemas.microsoft.com/office/word/2020/wordml/sdtdatahash" xmlns:w16se="http://schemas.microsoft.com/office/word/2015/wordml/symex" xmlns:wpg="http://schemas.microsoft.com/office/word/2010/wordprocessingGroup" xmlns:wpi="http://schemas.microsoft.com/office/word/2010/wordprocessingInk" xmlns:wne="http://schemas.microsoft.com/office/word/2006/wordml" xmlns:wps="http://schemas.microsoft.com/office/word/2010/wordprocessingShape" mc:Ignorable="w14 w15 w16se w16cid w16 w16cex w16sdtdh wp14">
+<w:hdr xmlns:wpc="http://schemas.microsoft.com/office/word/2010/wordprocessingCanvas" xmlns:cx="http://schemas.microsoft.com/office/drawing/2014/chartex" xmlns:cx1="http://schemas.microsoft.com/office/drawing/2015/9/8/chartex" xmlns:cx2="http://schemas.microsoft.com/office/drawing/2015/10/21/chartex" xmlns:cx3="http://schemas.microsoft.com/office/drawing/2016/5/9/chartex" xmlns:cx4="http://schemas.microsoft.com/office/drawing/2016/5/10/chartex" xmlns:cx5="http://schemas.microsoft.com/office/drawing/2016/5/11/chartex" xmlns:cx6="http://schemas.microsoft.com/office/drawing/2016/5/12/chartex" xmlns:cx7="http://schemas.microsoft.com/office/drawing/2016/5/13/chartex" xmlns:cx8="http://schemas.microsoft.com/office/drawing/2016/5/14/chartex" xmlns:mc="http://schemas.openxmlformats.org/markup-compatibility/2006" xmlns:aink="http://schemas.microsoft.com/office/drawing/2016/ink" xmlns:am3d="http://schemas.microsoft.com/office/drawing/2017/model3d" xmlns:o="urn:schemas-microsoft-com:office:office" xmlns:oel="http://schemas.microsoft.com/office/2019/extlst" xmlns:r="http://schemas.openxmlformats.org/officeDocument/2006/relationships" xmlns:m="http://schemas.openxmlformats.org/officeDocument/2006/math" xmlns:v="urn:schemas-microsoft-com:vml" xmlns:wp14="http://schemas.microsoft.com/office/word/2010/wordprocessingDrawing" xmlns:wp="http://schemas.openxmlformats.org/drawingml/2006/wordprocessingDrawing" xmlns:w10="urn:schemas-microsoft-com:office:word" xmlns:w="http://schemas.openxmlformats.org/wordprocessingml/2006/main" xmlns:w14="http://schemas.microsoft.com/office/word/2010/wordml" xmlns:w15="http://schemas.microsoft.com/office/word/2012/wordml" xmlns:w16cex="http://schemas.microsoft.com/office/word/2018/wordml/cex" xmlns:w16cid="http://schemas.microsoft.com/office/word/2016/wordml/cid" xmlns:w16="http://schemas.microsoft.com/office/word/2018/wordml" xmlns:w16du="http://schemas.microsoft.com/office/word/2023/wordml/word16du" xmlns:w16sdtdh="http://schemas.microsoft.com/office/word/2020/wordml/sdtdatahash" xmlns:w16sdtfl="http://schemas.microsoft.com/office/word/2024/wordml/sdtformatlock" xmlns:w16se="http://schemas.microsoft.com/office/word/2015/wordml/symex" xmlns:wpg="http://schemas.microsoft.com/office/word/2010/wordprocessingGroup" xmlns:wpi="http://schemas.microsoft.com/office/word/2010/wordprocessingInk" xmlns:wne="http://schemas.microsoft.com/office/word/2006/wordml" xmlns:wps="http://schemas.microsoft.com/office/word/2010/wordprocessingShape" mc:Ignorable="w14 w15 w16se w16cid w16 w16cex w16sdtdh w16sdtfl w16du wp14">
   <w:p>
     <w:pPr>
       <w:pStyle w:val="Header"/>
@@ -3656,7 +3729,7 @@
 </file>
 
 <file path=word/numbering.xml><?xml version="1.0" encoding="utf-8"?>
-<w:numbering xmlns:wpc="http://schemas.microsoft.com/office/word/2010/wordprocessingCanvas" xmlns:cx="http://schemas.microsoft.com/office/drawing/2014/chartex" xmlns:cx1="http://schemas.microsoft.com/office/drawing/2015/9/8/chartex" xmlns:cx2="http://schemas.microsoft.com/office/drawing/2015/10/21/chartex" xmlns:cx3="http://schemas.microsoft.com/office/drawing/2016/5/9/chartex" xmlns:cx4="http://schemas.microsoft.com/office/drawing/2016/5/10/chartex" xmlns:cx5="http://schemas.microsoft.com/office/drawing/2016/5/11/chartex" xmlns:cx6="http://schemas.microsoft.com/office/drawing/2016/5/12/chartex" xmlns:cx7="http://schemas.microsoft.com/office/drawing/2016/5/13/chartex" xmlns:cx8="http://schemas.microsoft.com/office/drawing/2016/5/14/chartex" xmlns:mc="http://schemas.openxmlformats.org/markup-compatibility/2006" xmlns:aink="http://schemas.microsoft.com/office/drawing/2016/ink" xmlns:am3d="http://schemas.microsoft.com/office/drawing/2017/model3d" xmlns:o="urn:schemas-microsoft-com:office:office" xmlns:oel="http://schemas.microsoft.com/office/2019/extlst" xmlns:r="http://schemas.openxmlformats.org/officeDocument/2006/relationships" xmlns:m="http://schemas.openxmlformats.org/officeDocument/2006/math" xmlns:v="urn:schemas-microsoft-com:vml" xmlns:wp14="http://schemas.microsoft.com/office/word/2010/wordprocessingDrawing" xmlns:wp="http://schemas.openxmlformats.org/drawingml/2006/wordprocessingDrawing" xmlns:w10="urn:schemas-microsoft-com:office:word" xmlns:w="http://schemas.openxmlformats.org/wordprocessingml/2006/main" xmlns:w14="http://schemas.microsoft.com/office/word/2010/wordml" xmlns:w15="http://schemas.microsoft.com/office/word/2012/wordml" xmlns:w16cex="http://schemas.microsoft.com/office/word/2018/wordml/cex" xmlns:w16cid="http://schemas.microsoft.com/office/word/2016/wordml/cid" xmlns:w16="http://schemas.microsoft.com/office/word/2018/wordml" xmlns:w16sdtdh="http://schemas.microsoft.com/office/word/2020/wordml/sdtdatahash" xmlns:w16se="http://schemas.microsoft.com/office/word/2015/wordml/symex" xmlns:wpg="http://schemas.microsoft.com/office/word/2010/wordprocessingGroup" xmlns:wpi="http://schemas.microsoft.com/office/word/2010/wordprocessingInk" xmlns:wne="http://schemas.microsoft.com/office/word/2006/wordml" xmlns:wps="http://schemas.microsoft.com/office/word/2010/wordprocessingShape" mc:Ignorable="w14 w15 w16se w16cid w16 w16cex w16sdtdh wp14">
+<w:numbering xmlns:wpc="http://schemas.microsoft.com/office/word/2010/wordprocessingCanvas" xmlns:cx="http://schemas.microsoft.com/office/drawing/2014/chartex" xmlns:cx1="http://schemas.microsoft.com/office/drawing/2015/9/8/chartex" xmlns:cx2="http://schemas.microsoft.com/office/drawing/2015/10/21/chartex" xmlns:cx3="http://schemas.microsoft.com/office/drawing/2016/5/9/chartex" xmlns:cx4="http://schemas.microsoft.com/office/drawing/2016/5/10/chartex" xmlns:cx5="http://schemas.microsoft.com/office/drawing/2016/5/11/chartex" xmlns:cx6="http://schemas.microsoft.com/office/drawing/2016/5/12/chartex" xmlns:cx7="http://schemas.microsoft.com/office/drawing/2016/5/13/chartex" xmlns:cx8="http://schemas.microsoft.com/office/drawing/2016/5/14/chartex" xmlns:mc="http://schemas.openxmlformats.org/markup-compatibility/2006" xmlns:aink="http://schemas.microsoft.com/office/drawing/2016/ink" xmlns:am3d="http://schemas.microsoft.com/office/drawing/2017/model3d" xmlns:o="urn:schemas-microsoft-com:office:office" xmlns:oel="http://schemas.microsoft.com/office/2019/extlst" xmlns:r="http://schemas.openxmlformats.org/officeDocument/2006/relationships" xmlns:m="http://schemas.openxmlformats.org/officeDocument/2006/math" xmlns:v="urn:schemas-microsoft-com:vml" xmlns:wp14="http://schemas.microsoft.com/office/word/2010/wordprocessingDrawing" xmlns:wp="http://schemas.openxmlformats.org/drawingml/2006/wordprocessingDrawing" xmlns:w10="urn:schemas-microsoft-com:office:word" xmlns:w="http://schemas.openxmlformats.org/wordprocessingml/2006/main" xmlns:w14="http://schemas.microsoft.com/office/word/2010/wordml" xmlns:w15="http://schemas.microsoft.com/office/word/2012/wordml" xmlns:w16cex="http://schemas.microsoft.com/office/word/2018/wordml/cex" xmlns:w16cid="http://schemas.microsoft.com/office/word/2016/wordml/cid" xmlns:w16="http://schemas.microsoft.com/office/word/2018/wordml" xmlns:w16du="http://schemas.microsoft.com/office/word/2023/wordml/word16du" xmlns:w16sdtdh="http://schemas.microsoft.com/office/word/2020/wordml/sdtdatahash" xmlns:w16sdtfl="http://schemas.microsoft.com/office/word/2024/wordml/sdtformatlock" xmlns:w16se="http://schemas.microsoft.com/office/word/2015/wordml/symex" xmlns:wpg="http://schemas.microsoft.com/office/word/2010/wordprocessingGroup" xmlns:wpi="http://schemas.microsoft.com/office/word/2010/wordprocessingInk" xmlns:wne="http://schemas.microsoft.com/office/word/2006/wordml" xmlns:wps="http://schemas.microsoft.com/office/word/2010/wordprocessingShape" mc:Ignorable="w14 w15 w16se w16cid w16 w16cex w16sdtdh w16sdtfl w16du wp14">
   <w:abstractNum w:abstractNumId="0" w15:restartNumberingAfterBreak="0">
     <w:nsid w:val="1F036A6D"/>
     <w:multiLevelType w:val="hybridMultilevel"/>
@@ -4376,7 +4449,7 @@
 </file>
 
 <file path=word/styles.xml><?xml version="1.0" encoding="utf-8"?>
-<w:styles xmlns:mc="http://schemas.openxmlformats.org/markup-compatibility/2006" xmlns:r="http://schemas.openxmlformats.org/officeDocument/2006/relationships" xmlns:w="http://schemas.openxmlformats.org/wordprocessingml/2006/main" xmlns:w14="http://schemas.microsoft.com/office/word/2010/wordml" xmlns:w15="http://schemas.microsoft.com/office/word/2012/wordml" xmlns:w16cex="http://schemas.microsoft.com/office/word/2018/wordml/cex" xmlns:w16cid="http://schemas.microsoft.com/office/word/2016/wordml/cid" xmlns:w16="http://schemas.microsoft.com/office/word/2018/wordml" xmlns:w16sdtdh="http://schemas.microsoft.com/office/word/2020/wordml/sdtdatahash" xmlns:w16se="http://schemas.microsoft.com/office/word/2015/wordml/symex" mc:Ignorable="w14 w15 w16se w16cid w16 w16cex w16sdtdh">
+<w:styles xmlns:mc="http://schemas.openxmlformats.org/markup-compatibility/2006" xmlns:r="http://schemas.openxmlformats.org/officeDocument/2006/relationships" xmlns:w="http://schemas.openxmlformats.org/wordprocessingml/2006/main" xmlns:w14="http://schemas.microsoft.com/office/word/2010/wordml" xmlns:w15="http://schemas.microsoft.com/office/word/2012/wordml" xmlns:w16cex="http://schemas.microsoft.com/office/word/2018/wordml/cex" xmlns:w16cid="http://schemas.microsoft.com/office/word/2016/wordml/cid" xmlns:w16="http://schemas.microsoft.com/office/word/2018/wordml" xmlns:w16du="http://schemas.microsoft.com/office/word/2023/wordml/word16du" xmlns:w16sdtdh="http://schemas.microsoft.com/office/word/2020/wordml/sdtdatahash" xmlns:w16sdtfl="http://schemas.microsoft.com/office/word/2024/wordml/sdtformatlock" xmlns:w16se="http://schemas.microsoft.com/office/word/2015/wordml/symex" mc:Ignorable="w14 w15 w16se w16cid w16 w16cex w16sdtdh w16sdtfl w16du">
   <w:docDefaults>
     <w:rPrDefault>
       <w:rPr>

</xml_diff>